<commit_message>
docs(guide): remove double bullets and fix list formatting in Telegram Bot manual docx
</commit_message>
<xml_diff>
--- a/docs/11-09-2026_TapNQue_Comprehensive_System_Guide_and_Telegram_Bot_Manual.docx
+++ b/docs/11-09-2026_TapNQue_Comprehensive_System_Guide_and_Telegram_Bot_Manual.docx
@@ -817,7 +817,7 @@
           <w:color w:val="000000"/>
           <w:sz w:val="22"/>
         </w:rPr>
-        <w:t xml:space="preserve">• </w:t>
+        <w:t xml:space="preserve">Student Touchscreen Kiosk (src/tapnque/ui/kiosk.py): </w:t>
       </w:r>
       <w:r>
         <w:rPr>
@@ -825,7 +825,7 @@
           <w:color w:val="000000"/>
           <w:sz w:val="22"/>
         </w:rPr>
-        <w:t>Student Touchscreen Kiosk (src/tapnque/ui/kiosk.py): Student intake terminal collecting student identification, optional Telegram handle or Chat ID, and displaying an on-screen high-resolution Telegram bot deep-link QR code.</w:t>
+        <w:t>Student intake terminal collecting student identification, optional Telegram handle or Chat ID, and displaying an on-screen high-resolution Telegram bot deep-link QR code.</w:t>
       </w:r>
     </w:p>
     <w:p>
@@ -840,7 +840,7 @@
           <w:color w:val="000000"/>
           <w:sz w:val="22"/>
         </w:rPr>
-        <w:t xml:space="preserve">• </w:t>
+        <w:t xml:space="preserve">Staff Admin Service Desk (src/tapnque/ui/staff.py): </w:t>
       </w:r>
       <w:r>
         <w:rPr>
@@ -848,7 +848,7 @@
           <w:color w:val="000000"/>
           <w:sz w:val="22"/>
         </w:rPr>
-        <w:t>Staff Admin Service Desk (src/tapnque/ui/staff.py): Counter workstation with dynamic counter selection, automated priority queueing, and multi-event Telegram dispatches (Call Next, Recall, Mark Done).</w:t>
+        <w:t>Counter workstation with dynamic counter selection, automated priority queueing, and multi-event Telegram dispatches (Call Next, Recall, Mark Done).</w:t>
       </w:r>
     </w:p>
     <w:p>
@@ -863,7 +863,7 @@
           <w:color w:val="000000"/>
           <w:sz w:val="22"/>
         </w:rPr>
-        <w:t xml:space="preserve">• </w:t>
+        <w:t xml:space="preserve">Super Admin Executive Console (src/tapnque/ui/super_admin.py): </w:t>
       </w:r>
       <w:r>
         <w:rPr>
@@ -871,7 +871,7 @@
           <w:color w:val="000000"/>
           <w:sz w:val="22"/>
         </w:rPr>
-        <w:t>Super Admin Executive Console (src/tapnque/ui/super_admin.py): Operational dashboard with real-time queue health gauges, Telegram Bot credentials management (@BotFather token &amp; username), live QR preview generator, custom markdown template editors, and mock Telegram log viewer.</w:t>
+        <w:t>Operational dashboard with real-time queue health gauges, Telegram Bot credentials management (@BotFather token &amp; username), live QR preview generator, custom markdown template editors, and mock Telegram log viewer.</w:t>
       </w:r>
     </w:p>
     <w:p>
@@ -886,7 +886,7 @@
           <w:color w:val="000000"/>
           <w:sz w:val="22"/>
         </w:rPr>
-        <w:t xml:space="preserve">• </w:t>
+        <w:t xml:space="preserve">Public TV / Lobby Monitor (src/tapnque/ui/monitor.py): </w:t>
       </w:r>
       <w:r>
         <w:rPr>
@@ -894,7 +894,7 @@
           <w:color w:val="000000"/>
           <w:sz w:val="22"/>
         </w:rPr>
-        <w:t>Public TV / Lobby Monitor (src/tapnque/ui/monitor.py): Fullscreen wall display featuring animated calling announcements, serving counter status cards, and upcoming waiting tickers.</w:t>
+        <w:t>Fullscreen wall display featuring animated calling announcements, serving counter status cards, and upcoming waiting tickers.</w:t>
       </w:r>
     </w:p>
     <w:p>
@@ -909,7 +909,7 @@
           <w:color w:val="000000"/>
           <w:sz w:val="22"/>
         </w:rPr>
-        <w:t xml:space="preserve">• </w:t>
+        <w:t xml:space="preserve">Core Database Engine (src/tapnque/core/database.py): </w:t>
       </w:r>
       <w:r>
         <w:rPr>
@@ -917,7 +917,7 @@
           <w:color w:val="000000"/>
           <w:sz w:val="22"/>
         </w:rPr>
-        <w:t>Core Database Engine (src/tapnque/core/database.py): SQLite manager operating in Write-Ahead Logging (WAL) mode with dedicated Telegram status columns and configuration persistence.</w:t>
+        <w:t>SQLite manager operating in Write-Ahead Logging (WAL) mode with dedicated Telegram status columns and configuration persistence.</w:t>
       </w:r>
     </w:p>
     <w:p>
@@ -932,7 +932,7 @@
           <w:color w:val="000000"/>
           <w:sz w:val="22"/>
         </w:rPr>
-        <w:t xml:space="preserve">• </w:t>
+        <w:t xml:space="preserve">Telegram Bot Notification Engine (src/tapnque/services/telegram_service.py): </w:t>
       </w:r>
       <w:r>
         <w:rPr>
@@ -940,7 +940,7 @@
           <w:color w:val="000000"/>
           <w:sz w:val="22"/>
         </w:rPr>
-        <w:t>Telegram Bot Notification Engine (src/tapnque/services/telegram_service.py): High-performance daemon queue worker with Telegram Bot API integration, QR generator, template formatter, and safe mock mode.</w:t>
+        <w:t>High-performance daemon queue worker with Telegram Bot API integration, QR generator, template formatter, and safe mock mode.</w:t>
       </w:r>
     </w:p>
     <w:p>
@@ -975,8 +975,8 @@
     </w:p>
     <w:p>
       <w:pPr>
-        <w:pStyle w:val="ListBullet"/>
-        <w:spacing w:line="276" w:lineRule="auto" w:before="0" w:after="60"/>
+        <w:spacing w:line="276" w:lineRule="auto" w:before="0" w:after="70"/>
+        <w:ind w:left="504" w:hanging="504"/>
       </w:pPr>
       <w:r>
         <w:rPr>
@@ -985,7 +985,17 @@
           <w:color w:val="000000"/>
           <w:sz w:val="22"/>
         </w:rPr>
-        <w:t xml:space="preserve">1. </w:t>
+        <w:t>1.</w:t>
+        <w:tab/>
+      </w:r>
+      <w:r>
+        <w:rPr>
+          <w:rFonts w:ascii="Times New Roman" w:hAnsi="Times New Roman"/>
+          <w:b/>
+          <w:color w:val="000000"/>
+          <w:sz w:val="22"/>
+        </w:rPr>
+        <w:t xml:space="preserve">Animated Startup Sequence: </w:t>
       </w:r>
       <w:r>
         <w:rPr>
@@ -993,13 +1003,13 @@
           <w:color w:val="000000"/>
           <w:sz w:val="22"/>
         </w:rPr>
-        <w:t>Animated Startup Sequence: Implements LoadingScreen with campus initialization checks before revealing the check-in form. Can be bypassed with Escape, Return, or Space.</w:t>
+        <w:t>Implements LoadingScreen with campus initialization checks before revealing the check-in form. Can be bypassed with Escape, Return, or Space.</w:t>
       </w:r>
     </w:p>
     <w:p>
       <w:pPr>
-        <w:pStyle w:val="ListBullet"/>
-        <w:spacing w:line="276" w:lineRule="auto" w:before="0" w:after="60"/>
+        <w:spacing w:line="276" w:lineRule="auto" w:before="0" w:after="70"/>
+        <w:ind w:left="504" w:hanging="504"/>
       </w:pPr>
       <w:r>
         <w:rPr>
@@ -1008,7 +1018,17 @@
           <w:color w:val="000000"/>
           <w:sz w:val="22"/>
         </w:rPr>
-        <w:t xml:space="preserve">2. </w:t>
+        <w:t>2.</w:t>
+        <w:tab/>
+      </w:r>
+      <w:r>
+        <w:rPr>
+          <w:rFonts w:ascii="Times New Roman" w:hAnsi="Times New Roman"/>
+          <w:b/>
+          <w:color w:val="000000"/>
+          <w:sz w:val="22"/>
+        </w:rPr>
+        <w:t xml:space="preserve">Form Field Structure: </w:t>
       </w:r>
       <w:r>
         <w:rPr>
@@ -1016,13 +1036,13 @@
           <w:color w:val="000000"/>
           <w:sz w:val="22"/>
         </w:rPr>
-        <w:t>Form Field Structure: Collects Student Name, Student Number (2023-00000), Email Address, Philippine Phone Number, Visitor Type, Telegram Username / Chat ID (Optional), and Purpose of Visit.</w:t>
+        <w:t>Collects Student Name, Student Number (2023-00000), Email Address, Philippine Phone Number, Visitor Type, Telegram Username / Chat ID (Optional), and Purpose of Visit.</w:t>
       </w:r>
     </w:p>
     <w:p>
       <w:pPr>
-        <w:pStyle w:val="ListBullet"/>
-        <w:spacing w:line="276" w:lineRule="auto" w:before="0" w:after="60"/>
+        <w:spacing w:line="276" w:lineRule="auto" w:before="0" w:after="70"/>
+        <w:ind w:left="504" w:hanging="504"/>
       </w:pPr>
       <w:r>
         <w:rPr>
@@ -1031,7 +1051,17 @@
           <w:color w:val="000000"/>
           <w:sz w:val="22"/>
         </w:rPr>
-        <w:t xml:space="preserve">3. </w:t>
+        <w:t>3.</w:t>
+        <w:tab/>
+      </w:r>
+      <w:r>
+        <w:rPr>
+          <w:rFonts w:ascii="Times New Roman" w:hAnsi="Times New Roman"/>
+          <w:b/>
+          <w:color w:val="000000"/>
+          <w:sz w:val="22"/>
+        </w:rPr>
+        <w:t xml:space="preserve">Dynamic Touch Keyboard: </w:t>
       </w:r>
       <w:r>
         <w:rPr>
@@ -1039,13 +1069,13 @@
           <w:color w:val="000000"/>
           <w:sz w:val="22"/>
         </w:rPr>
-        <w:t>Dynamic Touch Keyboard: Integrated virtual keyboard (TouchKeyboardWidget) slides up on input focus, offering QWERTY alphabetic and numeric keypad layouts.</w:t>
+        <w:t>Integrated virtual keyboard (TouchKeyboardWidget) slides up on input focus, offering QWERTY alphabetic and numeric keypad layouts.</w:t>
       </w:r>
     </w:p>
     <w:p>
       <w:pPr>
-        <w:pStyle w:val="ListBullet"/>
-        <w:spacing w:line="276" w:lineRule="auto" w:before="0" w:after="60"/>
+        <w:spacing w:line="276" w:lineRule="auto" w:before="0" w:after="70"/>
+        <w:ind w:left="504" w:hanging="504"/>
       </w:pPr>
       <w:r>
         <w:rPr>
@@ -1054,7 +1084,17 @@
           <w:color w:val="000000"/>
           <w:sz w:val="22"/>
         </w:rPr>
-        <w:t xml:space="preserve">4. </w:t>
+        <w:t>4.</w:t>
+        <w:tab/>
+      </w:r>
+      <w:r>
+        <w:rPr>
+          <w:rFonts w:ascii="Times New Roman" w:hAnsi="Times New Roman"/>
+          <w:b/>
+          <w:color w:val="000000"/>
+          <w:sz w:val="22"/>
+        </w:rPr>
+        <w:t xml:space="preserve">Priority Categorization: </w:t>
       </w:r>
       <w:r>
         <w:rPr>
@@ -1062,13 +1102,13 @@
           <w:color w:val="000000"/>
           <w:sz w:val="22"/>
         </w:rPr>
-        <w:t>Priority Categorization: PWD visitors receive 'High Priority', Parents receive 'Priority', and standard Students receive FIFO 'Standard' queuing.</w:t>
+        <w:t>PWD visitors receive 'High Priority', Parents receive 'Priority', and standard Students receive FIFO 'Standard' queuing.</w:t>
       </w:r>
     </w:p>
     <w:p>
       <w:pPr>
-        <w:pStyle w:val="ListBullet"/>
-        <w:spacing w:line="276" w:lineRule="auto" w:before="0" w:after="60"/>
+        <w:spacing w:line="276" w:lineRule="auto" w:before="0" w:after="70"/>
+        <w:ind w:left="504" w:hanging="504"/>
       </w:pPr>
       <w:r>
         <w:rPr>
@@ -1077,7 +1117,17 @@
           <w:color w:val="000000"/>
           <w:sz w:val="22"/>
         </w:rPr>
-        <w:t xml:space="preserve">5. </w:t>
+        <w:t>5.</w:t>
+        <w:tab/>
+      </w:r>
+      <w:r>
+        <w:rPr>
+          <w:rFonts w:ascii="Times New Roman" w:hAnsi="Times New Roman"/>
+          <w:b/>
+          <w:color w:val="000000"/>
+          <w:sz w:val="22"/>
+        </w:rPr>
+        <w:t xml:space="preserve">Branded Ticket Dialog with Embedded QR Code: </w:t>
       </w:r>
       <w:r>
         <w:rPr>
@@ -1085,13 +1135,13 @@
           <w:color w:val="000000"/>
           <w:sz w:val="22"/>
         </w:rPr>
-        <w:t>Branded Ticket Dialog with Embedded QR Code: TicketCreatedDialog renders a high-resolution QR code encoding https://t.me/&lt;bot_username&gt;?start=ticket_&lt;num&gt;. Scanning this QR opens Telegram directly to the bot with the ticket pre-loaded.</w:t>
+        <w:t>TicketCreatedDialog renders a high-resolution QR code encoding https://t.me/&lt;bot_username&gt;?start=ticket_&lt;num&gt;. Scanning this QR opens Telegram directly to the bot with the ticket pre-loaded.</w:t>
       </w:r>
     </w:p>
     <w:p>
       <w:pPr>
-        <w:pStyle w:val="ListBullet"/>
-        <w:spacing w:line="276" w:lineRule="auto" w:before="0" w:after="60"/>
+        <w:spacing w:line="276" w:lineRule="auto" w:before="0" w:after="70"/>
+        <w:ind w:left="504" w:hanging="504"/>
       </w:pPr>
       <w:r>
         <w:rPr>
@@ -1100,7 +1150,17 @@
           <w:color w:val="000000"/>
           <w:sz w:val="22"/>
         </w:rPr>
-        <w:t xml:space="preserve">6. </w:t>
+        <w:t>6.</w:t>
+        <w:tab/>
+      </w:r>
+      <w:r>
+        <w:rPr>
+          <w:rFonts w:ascii="Times New Roman" w:hAnsi="Times New Roman"/>
+          <w:b/>
+          <w:color w:val="000000"/>
+          <w:sz w:val="22"/>
+        </w:rPr>
+        <w:t xml:space="preserve">Automated Dispatch &amp; Reset: </w:t>
       </w:r>
       <w:r>
         <w:rPr>
@@ -1108,7 +1168,7 @@
           <w:color w:val="000000"/>
           <w:sz w:val="22"/>
         </w:rPr>
-        <w:t>Automated Dispatch &amp; Reset: If a Telegram handle or Chat ID was provided, an automated confirmation message is enqueued immediately. The dialog auto-resets after 8 seconds.</w:t>
+        <w:t>If a Telegram handle or Chat ID was provided, an automated confirmation message is enqueued immediately. The dialog auto-resets after 8 seconds.</w:t>
       </w:r>
     </w:p>
     <w:p>
@@ -1128,8 +1188,8 @@
     </w:p>
     <w:p>
       <w:pPr>
-        <w:pStyle w:val="ListBullet"/>
-        <w:spacing w:line="276" w:lineRule="auto" w:before="0" w:after="60"/>
+        <w:spacing w:line="276" w:lineRule="auto" w:before="0" w:after="70"/>
+        <w:ind w:left="504" w:hanging="504"/>
       </w:pPr>
       <w:r>
         <w:rPr>
@@ -1138,7 +1198,17 @@
           <w:color w:val="000000"/>
           <w:sz w:val="22"/>
         </w:rPr>
-        <w:t xml:space="preserve">1. </w:t>
+        <w:t>1.</w:t>
+        <w:tab/>
+      </w:r>
+      <w:r>
+        <w:rPr>
+          <w:rFonts w:ascii="Times New Roman" w:hAnsi="Times New Roman"/>
+          <w:b/>
+          <w:color w:val="000000"/>
+          <w:sz w:val="22"/>
+        </w:rPr>
+        <w:t xml:space="preserve">Dynamic Station Switching: </w:t>
       </w:r>
       <w:r>
         <w:rPr>
@@ -1146,13 +1216,13 @@
           <w:color w:val="000000"/>
           <w:sz w:val="22"/>
         </w:rPr>
-        <w:t>Dynamic Station Switching: Counter selector dropdown allows personnel to operate as Counter 1, Counter 2, Counter 3, or Counter 4.</w:t>
+        <w:t>Counter selector dropdown allows personnel to operate as Counter 1, Counter 2, Counter 3, or Counter 4.</w:t>
       </w:r>
     </w:p>
     <w:p>
       <w:pPr>
-        <w:pStyle w:val="ListBullet"/>
-        <w:spacing w:line="276" w:lineRule="auto" w:before="0" w:after="60"/>
+        <w:spacing w:line="276" w:lineRule="auto" w:before="0" w:after="70"/>
+        <w:ind w:left="504" w:hanging="504"/>
       </w:pPr>
       <w:r>
         <w:rPr>
@@ -1161,7 +1231,17 @@
           <w:color w:val="000000"/>
           <w:sz w:val="22"/>
         </w:rPr>
-        <w:t xml:space="preserve">2. </w:t>
+        <w:t>2.</w:t>
+        <w:tab/>
+      </w:r>
+      <w:r>
+        <w:rPr>
+          <w:rFonts w:ascii="Times New Roman" w:hAnsi="Times New Roman"/>
+          <w:b/>
+          <w:color w:val="000000"/>
+          <w:sz w:val="22"/>
+        </w:rPr>
+        <w:t xml:space="preserve">Priority Queue Ordering: </w:t>
       </w:r>
       <w:r>
         <w:rPr>
@@ -1169,13 +1249,13 @@
           <w:color w:val="000000"/>
           <w:sz w:val="22"/>
         </w:rPr>
-        <w:t>Priority Queue Ordering: Live table refreshing every 3 seconds, ordering waiting students strictly by priority rank and timestamp.</w:t>
+        <w:t>Live table refreshing every 3 seconds, ordering waiting students strictly by priority rank and timestamp.</w:t>
       </w:r>
     </w:p>
     <w:p>
       <w:pPr>
-        <w:pStyle w:val="ListBullet"/>
-        <w:spacing w:line="276" w:lineRule="auto" w:before="0" w:after="60"/>
+        <w:spacing w:line="276" w:lineRule="auto" w:before="0" w:after="70"/>
+        <w:ind w:left="504" w:hanging="504"/>
       </w:pPr>
       <w:r>
         <w:rPr>
@@ -1184,7 +1264,17 @@
           <w:color w:val="000000"/>
           <w:sz w:val="22"/>
         </w:rPr>
-        <w:t xml:space="preserve">3. </w:t>
+        <w:t>3.</w:t>
+        <w:tab/>
+      </w:r>
+      <w:r>
+        <w:rPr>
+          <w:rFonts w:ascii="Times New Roman" w:hAnsi="Times New Roman"/>
+          <w:b/>
+          <w:color w:val="000000"/>
+          <w:sz w:val="22"/>
+        </w:rPr>
+        <w:t xml:space="preserve">Call Next Action: </w:t>
       </w:r>
       <w:r>
         <w:rPr>
@@ -1192,13 +1282,13 @@
           <w:color w:val="000000"/>
           <w:sz w:val="22"/>
         </w:rPr>
-        <w:t>Call Next Action: Selects the next student, sets status to 'serving', marks called_at timestamp, announces on lobby monitor, and sends a Telegram 'NOW SERVING' notification to the student's phone.</w:t>
+        <w:t>Selects the next student, sets status to 'serving', marks called_at timestamp, announces on lobby monitor, and sends a Telegram 'NOW SERVING' notification to the student's phone.</w:t>
       </w:r>
     </w:p>
     <w:p>
       <w:pPr>
-        <w:pStyle w:val="ListBullet"/>
-        <w:spacing w:line="276" w:lineRule="auto" w:before="0" w:after="60"/>
+        <w:spacing w:line="276" w:lineRule="auto" w:before="0" w:after="70"/>
+        <w:ind w:left="504" w:hanging="504"/>
       </w:pPr>
       <w:r>
         <w:rPr>
@@ -1207,7 +1297,17 @@
           <w:color w:val="000000"/>
           <w:sz w:val="22"/>
         </w:rPr>
-        <w:t xml:space="preserve">4. </w:t>
+        <w:t>4.</w:t>
+        <w:tab/>
+      </w:r>
+      <w:r>
+        <w:rPr>
+          <w:rFonts w:ascii="Times New Roman" w:hAnsi="Times New Roman"/>
+          <w:b/>
+          <w:color w:val="000000"/>
+          <w:sz w:val="22"/>
+        </w:rPr>
+        <w:t xml:space="preserve">Recall Action: </w:t>
       </w:r>
       <w:r>
         <w:rPr>
@@ -1215,13 +1315,13 @@
           <w:color w:val="000000"/>
           <w:sz w:val="22"/>
         </w:rPr>
-        <w:t>Recall Action: Re-announces the ticket on the lobby screen and re-sends the Telegram alert to alert an absent visitor.</w:t>
+        <w:t>Re-announces the ticket on the lobby screen and re-sends the Telegram alert to alert an absent visitor.</w:t>
       </w:r>
     </w:p>
     <w:p>
       <w:pPr>
-        <w:pStyle w:val="ListBullet"/>
-        <w:spacing w:line="276" w:lineRule="auto" w:before="0" w:after="60"/>
+        <w:spacing w:line="276" w:lineRule="auto" w:before="0" w:after="70"/>
+        <w:ind w:left="504" w:hanging="504"/>
       </w:pPr>
       <w:r>
         <w:rPr>
@@ -1230,7 +1330,17 @@
           <w:color w:val="000000"/>
           <w:sz w:val="22"/>
         </w:rPr>
-        <w:t xml:space="preserve">5. </w:t>
+        <w:t>5.</w:t>
+        <w:tab/>
+      </w:r>
+      <w:r>
+        <w:rPr>
+          <w:rFonts w:ascii="Times New Roman" w:hAnsi="Times New Roman"/>
+          <w:b/>
+          <w:color w:val="000000"/>
+          <w:sz w:val="22"/>
+        </w:rPr>
+        <w:t xml:space="preserve">Mark Done Action: </w:t>
       </w:r>
       <w:r>
         <w:rPr>
@@ -1238,13 +1348,13 @@
           <w:color w:val="000000"/>
           <w:sz w:val="22"/>
         </w:rPr>
-        <w:t>Mark Done Action: Concludes service, marks completed_at, calculates wait duration, updates analytics, and dispatches a 'Service Completed' Telegram notification.</w:t>
+        <w:t>Concludes service, marks completed_at, calculates wait duration, updates analytics, and dispatches a 'Service Completed' Telegram notification.</w:t>
       </w:r>
     </w:p>
     <w:p>
       <w:pPr>
-        <w:pStyle w:val="ListBullet"/>
-        <w:spacing w:line="276" w:lineRule="auto" w:before="0" w:after="60"/>
+        <w:spacing w:line="276" w:lineRule="auto" w:before="0" w:after="70"/>
+        <w:ind w:left="504" w:hanging="504"/>
       </w:pPr>
       <w:r>
         <w:rPr>
@@ -1253,7 +1363,17 @@
           <w:color w:val="000000"/>
           <w:sz w:val="22"/>
         </w:rPr>
-        <w:t xml:space="preserve">6. </w:t>
+        <w:t>6.</w:t>
+        <w:tab/>
+      </w:r>
+      <w:r>
+        <w:rPr>
+          <w:rFonts w:ascii="Times New Roman" w:hAnsi="Times New Roman"/>
+          <w:b/>
+          <w:color w:val="000000"/>
+          <w:sz w:val="22"/>
+        </w:rPr>
+        <w:t xml:space="preserve">Service History Inspection: </w:t>
       </w:r>
       <w:r>
         <w:rPr>
@@ -1261,7 +1381,7 @@
           <w:color w:val="000000"/>
           <w:sz w:val="22"/>
         </w:rPr>
-        <w:t>Service History Inspection: HistoryDialog displays the last 30 completed transactions with date, time, and service metrics.</w:t>
+        <w:t>HistoryDialog displays the last 30 completed transactions with date, time, and service metrics.</w:t>
       </w:r>
     </w:p>
     <w:p>
@@ -1281,8 +1401,8 @@
     </w:p>
     <w:p>
       <w:pPr>
-        <w:pStyle w:val="ListBullet"/>
-        <w:spacing w:line="276" w:lineRule="auto" w:before="0" w:after="60"/>
+        <w:spacing w:line="276" w:lineRule="auto" w:before="0" w:after="70"/>
+        <w:ind w:left="504" w:hanging="504"/>
       </w:pPr>
       <w:r>
         <w:rPr>
@@ -1291,7 +1411,17 @@
           <w:color w:val="000000"/>
           <w:sz w:val="22"/>
         </w:rPr>
-        <w:t xml:space="preserve">1. </w:t>
+        <w:t>1.</w:t>
+        <w:tab/>
+      </w:r>
+      <w:r>
+        <w:rPr>
+          <w:rFonts w:ascii="Times New Roman" w:hAnsi="Times New Roman"/>
+          <w:b/>
+          <w:color w:val="000000"/>
+          <w:sz w:val="22"/>
+        </w:rPr>
+        <w:t xml:space="preserve">Analytics Dashboard (Tab 1): </w:t>
       </w:r>
       <w:r>
         <w:rPr>
@@ -1299,13 +1429,13 @@
           <w:color w:val="000000"/>
           <w:sz w:val="22"/>
         </w:rPr>
-        <w:t>Analytics Dashboard (Tab 1): Real-time metrics for Total Served, Average Wait Time, Active Waiting, and Serving Counters, with queue health indicator.</w:t>
+        <w:t>Real-time metrics for Total Served, Average Wait Time, Active Waiting, and Serving Counters, with queue health indicator.</w:t>
       </w:r>
     </w:p>
     <w:p>
       <w:pPr>
-        <w:pStyle w:val="ListBullet"/>
-        <w:spacing w:line="276" w:lineRule="auto" w:before="0" w:after="60"/>
+        <w:spacing w:line="276" w:lineRule="auto" w:before="0" w:after="70"/>
+        <w:ind w:left="504" w:hanging="504"/>
       </w:pPr>
       <w:r>
         <w:rPr>
@@ -1314,7 +1444,17 @@
           <w:color w:val="000000"/>
           <w:sz w:val="22"/>
         </w:rPr>
-        <w:t xml:space="preserve">2. </w:t>
+        <w:t>2.</w:t>
+        <w:tab/>
+      </w:r>
+      <w:r>
+        <w:rPr>
+          <w:rFonts w:ascii="Times New Roman" w:hAnsi="Times New Roman"/>
+          <w:b/>
+          <w:color w:val="000000"/>
+          <w:sz w:val="22"/>
+        </w:rPr>
+        <w:t xml:space="preserve">Consolidated Queue Monitor (Tab 2): </w:t>
       </w:r>
       <w:r>
         <w:rPr>
@@ -1322,13 +1462,13 @@
           <w:color w:val="000000"/>
           <w:sz w:val="22"/>
         </w:rPr>
-        <w:t>Consolidated Queue Monitor (Tab 2): Master table of all active and waiting tickets across campus.</w:t>
+        <w:t>Master table of all active and waiting tickets across campus.</w:t>
       </w:r>
     </w:p>
     <w:p>
       <w:pPr>
-        <w:pStyle w:val="ListBullet"/>
-        <w:spacing w:line="276" w:lineRule="auto" w:before="0" w:after="60"/>
+        <w:spacing w:line="276" w:lineRule="auto" w:before="0" w:after="70"/>
+        <w:ind w:left="504" w:hanging="504"/>
       </w:pPr>
       <w:r>
         <w:rPr>
@@ -1337,7 +1477,17 @@
           <w:color w:val="000000"/>
           <w:sz w:val="22"/>
         </w:rPr>
-        <w:t xml:space="preserve">3. </w:t>
+        <w:t>3.</w:t>
+        <w:tab/>
+      </w:r>
+      <w:r>
+        <w:rPr>
+          <w:rFonts w:ascii="Times New Roman" w:hAnsi="Times New Roman"/>
+          <w:b/>
+          <w:color w:val="000000"/>
+          <w:sz w:val="22"/>
+        </w:rPr>
+        <w:t xml:space="preserve">Telegram QR Bot Configuration (Tab 3): </w:t>
       </w:r>
       <w:r>
         <w:rPr>
@@ -1345,13 +1495,13 @@
           <w:color w:val="000000"/>
           <w:sz w:val="22"/>
         </w:rPr>
-        <w:t>Telegram QR Bot Configuration (Tab 3): Full operational control over the Telegram Bot subsystem.</w:t>
+        <w:t>Full operational control over the Telegram Bot subsystem.</w:t>
       </w:r>
     </w:p>
     <w:p>
       <w:pPr>
-        <w:pStyle w:val="ListBullet"/>
-        <w:spacing w:line="276" w:lineRule="auto" w:before="0" w:after="60"/>
+        <w:spacing w:line="276" w:lineRule="auto" w:before="0" w:after="70"/>
+        <w:ind w:left="504" w:hanging="504"/>
       </w:pPr>
       <w:r>
         <w:rPr>
@@ -1360,7 +1510,17 @@
           <w:color w:val="000000"/>
           <w:sz w:val="22"/>
         </w:rPr>
-        <w:t xml:space="preserve">4. </w:t>
+        <w:t>4.</w:t>
+        <w:tab/>
+      </w:r>
+      <w:r>
+        <w:rPr>
+          <w:rFonts w:ascii="Times New Roman" w:hAnsi="Times New Roman"/>
+          <w:b/>
+          <w:color w:val="000000"/>
+          <w:sz w:val="22"/>
+        </w:rPr>
+        <w:t xml:space="preserve">Master &amp; Mode Toggles: </w:t>
       </w:r>
       <w:r>
         <w:rPr>
@@ -1368,13 +1528,13 @@
           <w:color w:val="000000"/>
           <w:sz w:val="22"/>
         </w:rPr>
-        <w:t>Master &amp; Mode Toggles: One-click buttons to Enable/Disable Telegram alerts and switch between Safe Mock Simulation and Live Bot Mode.</w:t>
+        <w:t>One-click buttons to Enable/Disable Telegram alerts and switch between Safe Mock Simulation and Live Bot Mode.</w:t>
       </w:r>
     </w:p>
     <w:p>
       <w:pPr>
-        <w:pStyle w:val="ListBullet"/>
-        <w:spacing w:line="276" w:lineRule="auto" w:before="0" w:after="60"/>
+        <w:spacing w:line="276" w:lineRule="auto" w:before="0" w:after="70"/>
+        <w:ind w:left="504" w:hanging="504"/>
       </w:pPr>
       <w:r>
         <w:rPr>
@@ -1383,7 +1543,17 @@
           <w:color w:val="000000"/>
           <w:sz w:val="22"/>
         </w:rPr>
-        <w:t xml:space="preserve">5. </w:t>
+        <w:t>5.</w:t>
+        <w:tab/>
+      </w:r>
+      <w:r>
+        <w:rPr>
+          <w:rFonts w:ascii="Times New Roman" w:hAnsi="Times New Roman"/>
+          <w:b/>
+          <w:color w:val="000000"/>
+          <w:sz w:val="22"/>
+        </w:rPr>
+        <w:t xml:space="preserve">Bot Credentials &amp; Real-Time QR Preview: </w:t>
       </w:r>
       <w:r>
         <w:rPr>
@@ -1391,13 +1561,13 @@
           <w:color w:val="000000"/>
           <w:sz w:val="22"/>
         </w:rPr>
-        <w:t>Bot Credentials &amp; Real-Time QR Preview: Input fields for Bot Token and Bot Username. As the username is edited, a live QR code preview regenerates automatically.</w:t>
+        <w:t>Input fields for Bot Token and Bot Username. As the username is edited, a live QR code preview regenerates automatically.</w:t>
       </w:r>
     </w:p>
     <w:p>
       <w:pPr>
-        <w:pStyle w:val="ListBullet"/>
-        <w:spacing w:line="276" w:lineRule="auto" w:before="0" w:after="60"/>
+        <w:spacing w:line="276" w:lineRule="auto" w:before="0" w:after="70"/>
+        <w:ind w:left="504" w:hanging="504"/>
       </w:pPr>
       <w:r>
         <w:rPr>
@@ -1406,7 +1576,17 @@
           <w:color w:val="000000"/>
           <w:sz w:val="22"/>
         </w:rPr>
-        <w:t xml:space="preserve">6. </w:t>
+        <w:t>6.</w:t>
+        <w:tab/>
+      </w:r>
+      <w:r>
+        <w:rPr>
+          <w:rFonts w:ascii="Times New Roman" w:hAnsi="Times New Roman"/>
+          <w:b/>
+          <w:color w:val="000000"/>
+          <w:sz w:val="22"/>
+        </w:rPr>
+        <w:t xml:space="preserve">Markdown Template Editors: </w:t>
       </w:r>
       <w:r>
         <w:rPr>
@@ -1414,13 +1594,13 @@
           <w:color w:val="000000"/>
           <w:sz w:val="22"/>
         </w:rPr>
-        <w:t>Markdown Template Editors: Full customizable message templates supporting contextual placeholders ({name}, {ticket}, {position}, {purpose}, {counter}).</w:t>
+        <w:t>Full customizable message templates supporting contextual placeholders ({name}, {ticket}, {position}, {purpose}, {counter}).</w:t>
       </w:r>
     </w:p>
     <w:p>
       <w:pPr>
-        <w:pStyle w:val="ListBullet"/>
-        <w:spacing w:line="276" w:lineRule="auto" w:before="0" w:after="60"/>
+        <w:spacing w:line="276" w:lineRule="auto" w:before="0" w:after="70"/>
+        <w:ind w:left="504" w:hanging="504"/>
       </w:pPr>
       <w:r>
         <w:rPr>
@@ -1429,7 +1609,17 @@
           <w:color w:val="000000"/>
           <w:sz w:val="22"/>
         </w:rPr>
-        <w:t xml:space="preserve">7. </w:t>
+        <w:t>7.</w:t>
+        <w:tab/>
+      </w:r>
+      <w:r>
+        <w:rPr>
+          <w:rFonts w:ascii="Times New Roman" w:hAnsi="Times New Roman"/>
+          <w:b/>
+          <w:color w:val="000000"/>
+          <w:sz w:val="22"/>
+        </w:rPr>
+        <w:t xml:space="preserve">Test Telegram Dispatch Tool: </w:t>
       </w:r>
       <w:r>
         <w:rPr>
@@ -1437,13 +1627,13 @@
           <w:color w:val="000000"/>
           <w:sz w:val="22"/>
         </w:rPr>
-        <w:t>Test Telegram Dispatch Tool: Modal input allowing administrators to test live or mock delivery to any Chat ID or username.</w:t>
+        <w:t>Modal input allowing administrators to test live or mock delivery to any Chat ID or username.</w:t>
       </w:r>
     </w:p>
     <w:p>
       <w:pPr>
-        <w:pStyle w:val="ListBullet"/>
-        <w:spacing w:line="276" w:lineRule="auto" w:before="0" w:after="60"/>
+        <w:spacing w:line="276" w:lineRule="auto" w:before="0" w:after="70"/>
+        <w:ind w:left="504" w:hanging="504"/>
       </w:pPr>
       <w:r>
         <w:rPr>
@@ -1452,7 +1642,17 @@
           <w:color w:val="000000"/>
           <w:sz w:val="22"/>
         </w:rPr>
-        <w:t xml:space="preserve">8. </w:t>
+        <w:t>8.</w:t>
+        <w:tab/>
+      </w:r>
+      <w:r>
+        <w:rPr>
+          <w:rFonts w:ascii="Times New Roman" w:hAnsi="Times New Roman"/>
+          <w:b/>
+          <w:color w:val="000000"/>
+          <w:sz w:val="22"/>
+        </w:rPr>
+        <w:t xml:space="preserve">Mock Telegram Log Inspector: </w:t>
       </w:r>
       <w:r>
         <w:rPr>
@@ -1460,13 +1660,13 @@
           <w:color w:val="000000"/>
           <w:sz w:val="22"/>
         </w:rPr>
-        <w:t>Mock Telegram Log Inspector: Interactive dialog (TelegramLogDialog) displaying session mock logs with timestamps, event types, recipient IDs, and message bodies.</w:t>
+        <w:t>Interactive dialog (TelegramLogDialog) displaying session mock logs with timestamps, event types, recipient handles, and message bodies.</w:t>
       </w:r>
     </w:p>
     <w:p>
       <w:pPr>
-        <w:pStyle w:val="ListBullet"/>
-        <w:spacing w:line="276" w:lineRule="auto" w:before="0" w:after="60"/>
+        <w:spacing w:line="276" w:lineRule="auto" w:before="0" w:after="70"/>
+        <w:ind w:left="504" w:hanging="504"/>
       </w:pPr>
       <w:r>
         <w:rPr>
@@ -1475,7 +1675,17 @@
           <w:color w:val="000000"/>
           <w:sz w:val="22"/>
         </w:rPr>
-        <w:t xml:space="preserve">9. </w:t>
+        <w:t>9.</w:t>
+        <w:tab/>
+      </w:r>
+      <w:r>
+        <w:rPr>
+          <w:rFonts w:ascii="Times New Roman" w:hAnsi="Times New Roman"/>
+          <w:b/>
+          <w:color w:val="000000"/>
+          <w:sz w:val="22"/>
+        </w:rPr>
+        <w:t xml:space="preserve">Database Maintenance: </w:t>
       </w:r>
       <w:r>
         <w:rPr>
@@ -1483,7 +1693,7 @@
           <w:color w:val="000000"/>
           <w:sz w:val="22"/>
         </w:rPr>
-        <w:t>Database Maintenance: Tools to purge completed tickets, reset counters, and export queue telemetry to JSON.</w:t>
+        <w:t>Tools to purge completed tickets, reset counters, and export queue telemetry to JSON.</w:t>
       </w:r>
     </w:p>
     <w:p>
@@ -1513,7 +1723,7 @@
           <w:color w:val="000000"/>
           <w:sz w:val="22"/>
         </w:rPr>
-        <w:t xml:space="preserve">• </w:t>
+        <w:t xml:space="preserve">High-Contrast Visual Styling: </w:t>
       </w:r>
       <w:r>
         <w:rPr>
@@ -1521,7 +1731,7 @@
           <w:color w:val="000000"/>
           <w:sz w:val="22"/>
         </w:rPr>
-        <w:t>High-Contrast Visual Styling: Dark navy and emerald design readable from across large university waiting lobbies.</w:t>
+        <w:t>Dark navy and emerald design readable from across large university waiting lobbies.</w:t>
       </w:r>
     </w:p>
     <w:p>
@@ -1536,7 +1746,7 @@
           <w:color w:val="000000"/>
           <w:sz w:val="22"/>
         </w:rPr>
-        <w:t xml:space="preserve">• </w:t>
+        <w:t xml:space="preserve">Animated Call Alerts: </w:t>
       </w:r>
       <w:r>
         <w:rPr>
@@ -1544,7 +1754,7 @@
           <w:color w:val="000000"/>
           <w:sz w:val="22"/>
         </w:rPr>
-        <w:t>Animated Call Alerts: Flashing border highlights and visual call animations triggered whenever counter staff calls or recalls a ticket.</w:t>
+        <w:t>Flashing border highlights and visual call animations triggered whenever counter staff calls or recalls a ticket.</w:t>
       </w:r>
     </w:p>
     <w:p>
@@ -1559,7 +1769,7 @@
           <w:color w:val="000000"/>
           <w:sz w:val="22"/>
         </w:rPr>
-        <w:t xml:space="preserve">• </w:t>
+        <w:t xml:space="preserve">Upcoming Queue Ticker: </w:t>
       </w:r>
       <w:r>
         <w:rPr>
@@ -1567,7 +1777,7 @@
           <w:color w:val="000000"/>
           <w:sz w:val="22"/>
         </w:rPr>
-        <w:t>Upcoming Queue Ticker: Live sidebar displaying upcoming tickets so students can prepare as their turn approaches.</w:t>
+        <w:t>Live sidebar displaying upcoming tickets so students can prepare as their turn approaches.</w:t>
       </w:r>
     </w:p>
     <w:p>
@@ -2230,7 +2440,7 @@
           <w:color w:val="000000"/>
           <w:sz w:val="22"/>
         </w:rPr>
-        <w:t xml:space="preserve">• </w:t>
+        <w:t xml:space="preserve">Endpoint URL: </w:t>
       </w:r>
       <w:r>
         <w:rPr>
@@ -2238,7 +2448,7 @@
           <w:color w:val="000000"/>
           <w:sz w:val="22"/>
         </w:rPr>
-        <w:t>Endpoint URL: https://api.telegram.org/bot&lt;bot_token&gt;/sendMessage</w:t>
+        <w:t>https://api.telegram.org/bot&lt;bot_token&gt;/sendMessage</w:t>
       </w:r>
     </w:p>
     <w:p>
@@ -2253,7 +2463,7 @@
           <w:color w:val="000000"/>
           <w:sz w:val="22"/>
         </w:rPr>
-        <w:t xml:space="preserve">• </w:t>
+        <w:t xml:space="preserve">HTTP Method: </w:t>
       </w:r>
       <w:r>
         <w:rPr>
@@ -2261,7 +2471,7 @@
           <w:color w:val="000000"/>
           <w:sz w:val="22"/>
         </w:rPr>
-        <w:t>HTTP Method: POST</w:t>
+        <w:t>POST</w:t>
       </w:r>
     </w:p>
     <w:p>
@@ -2276,7 +2486,7 @@
           <w:color w:val="000000"/>
           <w:sz w:val="22"/>
         </w:rPr>
-        <w:t xml:space="preserve">• </w:t>
+        <w:t xml:space="preserve">Request Headers: </w:t>
       </w:r>
       <w:r>
         <w:rPr>
@@ -2284,7 +2494,7 @@
           <w:color w:val="000000"/>
           <w:sz w:val="22"/>
         </w:rPr>
-        <w:t>Request Headers: Content-Type: application/json, Accept: application/json</w:t>
+        <w:t>Content-Type: application/json, Accept: application/json</w:t>
       </w:r>
     </w:p>
     <w:p>
@@ -2299,7 +2509,7 @@
           <w:color w:val="000000"/>
           <w:sz w:val="22"/>
         </w:rPr>
-        <w:t xml:space="preserve">• </w:t>
+        <w:t xml:space="preserve">JSON Request Payload: </w:t>
       </w:r>
       <w:r>
         <w:rPr>
@@ -2307,8 +2517,6 @@
           <w:color w:val="000000"/>
           <w:sz w:val="22"/>
         </w:rPr>
-        <w:t>JSON Request Payload:</w:t>
-        <w:br/>
         <w:t>{</w:t>
         <w:br/>
         <w:t xml:space="preserve">  "chat_id": "@student_or_numeric_chat_id",</w:t>
@@ -2334,7 +2542,7 @@
           <w:color w:val="000000"/>
           <w:sz w:val="22"/>
         </w:rPr>
-        <w:t xml:space="preserve">• </w:t>
+        <w:t xml:space="preserve">Response Handling: </w:t>
       </w:r>
       <w:r>
         <w:rPr>
@@ -2342,7 +2550,7 @@
           <w:color w:val="000000"/>
           <w:sz w:val="22"/>
         </w:rPr>
-        <w:t>Response Handling: Parses JSON response status. Success returns code 200 with message ID; errors are captured in database logs without interrupting user workflow.</w:t>
+        <w:t>Parses JSON response status. Success returns code 200 with message ID; errors are captured in database logs without interrupting user workflow.</w:t>
       </w:r>
     </w:p>
     <w:p>
@@ -2362,8 +2570,8 @@
     </w:p>
     <w:p>
       <w:pPr>
-        <w:pStyle w:val="ListBullet"/>
-        <w:spacing w:line="276" w:lineRule="auto" w:before="0" w:after="60"/>
+        <w:spacing w:line="276" w:lineRule="auto" w:before="0" w:after="70"/>
+        <w:ind w:left="504" w:hanging="504"/>
       </w:pPr>
       <w:r>
         <w:rPr>
@@ -2372,7 +2580,17 @@
           <w:color w:val="000000"/>
           <w:sz w:val="22"/>
         </w:rPr>
-        <w:t xml:space="preserve">1. </w:t>
+        <w:t>1.</w:t>
+        <w:tab/>
+      </w:r>
+      <w:r>
+        <w:rPr>
+          <w:rFonts w:ascii="Times New Roman" w:hAnsi="Times New Roman"/>
+          <w:b/>
+          <w:color w:val="000000"/>
+          <w:sz w:val="22"/>
+        </w:rPr>
+        <w:t xml:space="preserve">Access BotFather: </w:t>
       </w:r>
       <w:r>
         <w:rPr>
@@ -2380,13 +2598,13 @@
           <w:color w:val="000000"/>
           <w:sz w:val="22"/>
         </w:rPr>
-        <w:t>Step 1: Open Telegram on any device and search for @BotFather (official verified bot with blue checkmark).</w:t>
+        <w:t>Open Telegram on any device and search for @BotFather (official verified bot with blue checkmark).</w:t>
       </w:r>
     </w:p>
     <w:p>
       <w:pPr>
-        <w:pStyle w:val="ListBullet"/>
-        <w:spacing w:line="276" w:lineRule="auto" w:before="0" w:after="60"/>
+        <w:spacing w:line="276" w:lineRule="auto" w:before="0" w:after="70"/>
+        <w:ind w:left="504" w:hanging="504"/>
       </w:pPr>
       <w:r>
         <w:rPr>
@@ -2395,7 +2613,17 @@
           <w:color w:val="000000"/>
           <w:sz w:val="22"/>
         </w:rPr>
-        <w:t xml:space="preserve">2. </w:t>
+        <w:t>2.</w:t>
+        <w:tab/>
+      </w:r>
+      <w:r>
+        <w:rPr>
+          <w:rFonts w:ascii="Times New Roman" w:hAnsi="Times New Roman"/>
+          <w:b/>
+          <w:color w:val="000000"/>
+          <w:sz w:val="22"/>
+        </w:rPr>
+        <w:t xml:space="preserve">Initiate Creation: </w:t>
       </w:r>
       <w:r>
         <w:rPr>
@@ -2403,13 +2631,13 @@
           <w:color w:val="000000"/>
           <w:sz w:val="22"/>
         </w:rPr>
-        <w:t>Step 2: Send the command: /newbot</w:t>
+        <w:t>Send the command: /newbot</w:t>
       </w:r>
     </w:p>
     <w:p>
       <w:pPr>
-        <w:pStyle w:val="ListBullet"/>
-        <w:spacing w:line="276" w:lineRule="auto" w:before="0" w:after="60"/>
+        <w:spacing w:line="276" w:lineRule="auto" w:before="0" w:after="70"/>
+        <w:ind w:left="504" w:hanging="504"/>
       </w:pPr>
       <w:r>
         <w:rPr>
@@ -2418,7 +2646,17 @@
           <w:color w:val="000000"/>
           <w:sz w:val="22"/>
         </w:rPr>
-        <w:t xml:space="preserve">3. </w:t>
+        <w:t>3.</w:t>
+        <w:tab/>
+      </w:r>
+      <w:r>
+        <w:rPr>
+          <w:rFonts w:ascii="Times New Roman" w:hAnsi="Times New Roman"/>
+          <w:b/>
+          <w:color w:val="000000"/>
+          <w:sz w:val="22"/>
+        </w:rPr>
+        <w:t xml:space="preserve">Configure Display Name: </w:t>
       </w:r>
       <w:r>
         <w:rPr>
@@ -2426,13 +2664,13 @@
           <w:color w:val="000000"/>
           <w:sz w:val="22"/>
         </w:rPr>
-        <w:t>Step 3: Enter a display name for the bot (e.g. TapNQue Queue Alert Bot).</w:t>
+        <w:t>Enter a display name for the bot (e.g. TapNQue Queue Alert Bot).</w:t>
       </w:r>
     </w:p>
     <w:p>
       <w:pPr>
-        <w:pStyle w:val="ListBullet"/>
-        <w:spacing w:line="276" w:lineRule="auto" w:before="0" w:after="60"/>
+        <w:spacing w:line="276" w:lineRule="auto" w:before="0" w:after="70"/>
+        <w:ind w:left="504" w:hanging="504"/>
       </w:pPr>
       <w:r>
         <w:rPr>
@@ -2441,7 +2679,17 @@
           <w:color w:val="000000"/>
           <w:sz w:val="22"/>
         </w:rPr>
-        <w:t xml:space="preserve">4. </w:t>
+        <w:t>4.</w:t>
+        <w:tab/>
+      </w:r>
+      <w:r>
+        <w:rPr>
+          <w:rFonts w:ascii="Times New Roman" w:hAnsi="Times New Roman"/>
+          <w:b/>
+          <w:color w:val="000000"/>
+          <w:sz w:val="22"/>
+        </w:rPr>
+        <w:t xml:space="preserve">Configure Bot Handle: </w:t>
       </w:r>
       <w:r>
         <w:rPr>
@@ -2449,13 +2697,13 @@
           <w:color w:val="000000"/>
           <w:sz w:val="22"/>
         </w:rPr>
-        <w:t>Step 4: Enter a unique bot username ending in 'bot' (e.g. OlfuTapNQueBot or TapNQueQueueBot).</w:t>
+        <w:t>Enter a unique bot username ending in 'bot' (e.g. OlfuTapNQueBot or TapNQueQueueBot).</w:t>
       </w:r>
     </w:p>
     <w:p>
       <w:pPr>
-        <w:pStyle w:val="ListBullet"/>
-        <w:spacing w:line="276" w:lineRule="auto" w:before="0" w:after="60"/>
+        <w:spacing w:line="276" w:lineRule="auto" w:before="0" w:after="70"/>
+        <w:ind w:left="504" w:hanging="504"/>
       </w:pPr>
       <w:r>
         <w:rPr>
@@ -2464,7 +2712,17 @@
           <w:color w:val="000000"/>
           <w:sz w:val="22"/>
         </w:rPr>
-        <w:t xml:space="preserve">5. </w:t>
+        <w:t>5.</w:t>
+        <w:tab/>
+      </w:r>
+      <w:r>
+        <w:rPr>
+          <w:rFonts w:ascii="Times New Roman" w:hAnsi="Times New Roman"/>
+          <w:b/>
+          <w:color w:val="000000"/>
+          <w:sz w:val="22"/>
+        </w:rPr>
+        <w:t xml:space="preserve">Obtain API Token: </w:t>
       </w:r>
       <w:r>
         <w:rPr>
@@ -2472,15 +2730,13 @@
           <w:color w:val="000000"/>
           <w:sz w:val="22"/>
         </w:rPr>
-        <w:t>Step 5: @BotFather will return your HTTP API Token:</w:t>
-        <w:br/>
-        <w:t>1234567890:ABCdefGhIJKlmNoPQRsTUVwxyZ12345</w:t>
+        <w:t>@BotFather will return your HTTP API Token: 1234567890:ABCdefGhIJKlmNoPQRsTUVwxyZ12345</w:t>
       </w:r>
     </w:p>
     <w:p>
       <w:pPr>
-        <w:pStyle w:val="ListBullet"/>
-        <w:spacing w:line="276" w:lineRule="auto" w:before="0" w:after="60"/>
+        <w:spacing w:line="276" w:lineRule="auto" w:before="0" w:after="70"/>
+        <w:ind w:left="504" w:hanging="504"/>
       </w:pPr>
       <w:r>
         <w:rPr>
@@ -2489,7 +2745,17 @@
           <w:color w:val="000000"/>
           <w:sz w:val="22"/>
         </w:rPr>
-        <w:t xml:space="preserve">6. </w:t>
+        <w:t>6.</w:t>
+        <w:tab/>
+      </w:r>
+      <w:r>
+        <w:rPr>
+          <w:rFonts w:ascii="Times New Roman" w:hAnsi="Times New Roman"/>
+          <w:b/>
+          <w:color w:val="000000"/>
+          <w:sz w:val="22"/>
+        </w:rPr>
+        <w:t xml:space="preserve">Access Super Admin: </w:t>
       </w:r>
       <w:r>
         <w:rPr>
@@ -2497,13 +2763,13 @@
           <w:color w:val="000000"/>
           <w:sz w:val="22"/>
         </w:rPr>
-        <w:t>Step 6: Open Super Admin &gt; Settings &gt; Telegram QR Bot System Configuration.</w:t>
+        <w:t>Open Super Admin &gt; Settings &gt; Telegram QR Bot System Configuration.</w:t>
       </w:r>
     </w:p>
     <w:p>
       <w:pPr>
-        <w:pStyle w:val="ListBullet"/>
-        <w:spacing w:line="276" w:lineRule="auto" w:before="0" w:after="60"/>
+        <w:spacing w:line="276" w:lineRule="auto" w:before="0" w:after="70"/>
+        <w:ind w:left="504" w:hanging="504"/>
       </w:pPr>
       <w:r>
         <w:rPr>
@@ -2512,7 +2778,17 @@
           <w:color w:val="000000"/>
           <w:sz w:val="22"/>
         </w:rPr>
-        <w:t xml:space="preserve">7. </w:t>
+        <w:t>7.</w:t>
+        <w:tab/>
+      </w:r>
+      <w:r>
+        <w:rPr>
+          <w:rFonts w:ascii="Times New Roman" w:hAnsi="Times New Roman"/>
+          <w:b/>
+          <w:color w:val="000000"/>
+          <w:sz w:val="22"/>
+        </w:rPr>
+        <w:t xml:space="preserve">Save Credentials: </w:t>
       </w:r>
       <w:r>
         <w:rPr>
@@ -2520,13 +2796,13 @@
           <w:color w:val="000000"/>
           <w:sz w:val="22"/>
         </w:rPr>
-        <w:t>Step 7: Paste the token into 'Telegram Bot Token' and the username into 'Telegram Bot Username'.</w:t>
+        <w:t>Paste the token into 'Telegram Bot Token' and the username into 'Telegram Bot Username'.</w:t>
       </w:r>
     </w:p>
     <w:p>
       <w:pPr>
-        <w:pStyle w:val="ListBullet"/>
-        <w:spacing w:line="276" w:lineRule="auto" w:before="0" w:after="60"/>
+        <w:spacing w:line="276" w:lineRule="auto" w:before="0" w:after="70"/>
+        <w:ind w:left="504" w:hanging="504"/>
       </w:pPr>
       <w:r>
         <w:rPr>
@@ -2535,7 +2811,17 @@
           <w:color w:val="000000"/>
           <w:sz w:val="22"/>
         </w:rPr>
-        <w:t xml:space="preserve">8. </w:t>
+        <w:t>8.</w:t>
+        <w:tab/>
+      </w:r>
+      <w:r>
+        <w:rPr>
+          <w:rFonts w:ascii="Times New Roman" w:hAnsi="Times New Roman"/>
+          <w:b/>
+          <w:color w:val="000000"/>
+          <w:sz w:val="22"/>
+        </w:rPr>
+        <w:t xml:space="preserve">Activate Live Mode: </w:t>
       </w:r>
       <w:r>
         <w:rPr>
@@ -2543,7 +2829,7 @@
           <w:color w:val="000000"/>
           <w:sz w:val="22"/>
         </w:rPr>
-        <w:t>Step 8: Click 'SWITCH TO LIVE BOT' and save configuration.</w:t>
+        <w:t>Click 'SWITCH TO LIVE BOT' and save configuration.</w:t>
       </w:r>
     </w:p>
     <w:p>
@@ -3082,7 +3368,7 @@
           <w:color w:val="000000"/>
           <w:sz w:val="22"/>
         </w:rPr>
-        <w:t xml:space="preserve">• </w:t>
+        <w:t xml:space="preserve">Zero Configuration Required: </w:t>
       </w:r>
       <w:r>
         <w:rPr>
@@ -3090,7 +3376,7 @@
           <w:color w:val="000000"/>
           <w:sz w:val="22"/>
         </w:rPr>
-        <w:t>Zero Configuration Required: Enabled by default (telegram_mock_mode = 1). Operates locally without an active Telegram Bot Token or internet connection.</w:t>
+        <w:t>Enabled by default (telegram_mock_mode = 1). Operates locally without an active Telegram Bot Token or internet connection.</w:t>
       </w:r>
     </w:p>
     <w:p>
@@ -3105,7 +3391,7 @@
           <w:color w:val="000000"/>
           <w:sz w:val="22"/>
         </w:rPr>
-        <w:t xml:space="preserve">• </w:t>
+        <w:t xml:space="preserve">Terminal Audit Logging: </w:t>
       </w:r>
       <w:r>
         <w:rPr>
@@ -3113,7 +3399,7 @@
           <w:color w:val="000000"/>
           <w:sz w:val="22"/>
         </w:rPr>
-        <w:t>Terminal Audit Logging: Outputs clear visual dispatch blocks to stdout:</w:t>
+        <w:t>Outputs clear visual dispatch blocks to stdout:</w:t>
         <w:br/>
         <w:t>✈️ [TELEGRAM BOT SIMULATION] To: @student | Event: CALLED | Ticket: #0005</w:t>
         <w:br/>
@@ -3132,7 +3418,7 @@
           <w:color w:val="000000"/>
           <w:sz w:val="22"/>
         </w:rPr>
-        <w:t xml:space="preserve">• </w:t>
+        <w:t xml:space="preserve">Live GUI Inspector (TelegramLogDialog): </w:t>
       </w:r>
       <w:r>
         <w:rPr>
@@ -3140,7 +3426,7 @@
           <w:color w:val="000000"/>
           <w:sz w:val="22"/>
         </w:rPr>
-        <w:t>Live GUI Inspector (TelegramLogDialog): Clicking 'VIEW MOCK TELEGRAM LOGS' in Super Admin opens a dedicated table showing all simulated dispatches, timestamps, recipient handles, and rendered markdown text.</w:t>
+        <w:t>Clicking 'VIEW MOCK TELEGRAM LOGS' in Super Admin opens a dedicated table showing all simulated dispatches, timestamps, recipient handles, and rendered markdown text.</w:t>
       </w:r>
     </w:p>
     <w:p>
@@ -3155,7 +3441,7 @@
           <w:color w:val="000000"/>
           <w:sz w:val="22"/>
         </w:rPr>
-        <w:t xml:space="preserve">• </w:t>
+        <w:t xml:space="preserve">Failsafe Fallback: </w:t>
       </w:r>
       <w:r>
         <w:rPr>
@@ -3163,7 +3449,7 @@
           <w:color w:val="000000"/>
           <w:sz w:val="22"/>
         </w:rPr>
-        <w:t>Failsafe Fallback: If Live Mode is selected but the Bot Token is missing, the system automatically falls back to Mock Simulation, preventing crashes.</w:t>
+        <w:t>If Live Mode is selected but the Bot Token is missing, the system automatically falls back to Mock Simulation, preventing crashes.</w:t>
       </w:r>
     </w:p>
     <w:p>
@@ -3236,7 +3522,7 @@
           <w:color w:val="000000"/>
           <w:sz w:val="22"/>
         </w:rPr>
-        <w:t xml:space="preserve">• </w:t>
+        <w:t xml:space="preserve">Project6 (/home/javvii/FreelanceProject/Project6): </w:t>
       </w:r>
       <w:r>
         <w:rPr>
@@ -3244,7 +3530,7 @@
           <w:color w:val="000000"/>
           <w:sz w:val="22"/>
         </w:rPr>
-        <w:t>Project6 (/home/javvii/FreelanceProject/Project6): Connects strictly to Project6/data/kiosk.db and operates on the philsms-version branch.</w:t>
+        <w:t>Connects strictly to Project6/data/kiosk.db and operates on the philsms-version branch.</w:t>
       </w:r>
     </w:p>
     <w:p>
@@ -3259,7 +3545,7 @@
           <w:color w:val="000000"/>
           <w:sz w:val="22"/>
         </w:rPr>
-        <w:t xml:space="preserve">• </w:t>
+        <w:t xml:space="preserve">Project6.1 (/home/javvii/FreelanceProject/Project6.1): </w:t>
       </w:r>
       <w:r>
         <w:rPr>
@@ -3267,7 +3553,7 @@
           <w:color w:val="000000"/>
           <w:sz w:val="22"/>
         </w:rPr>
-        <w:t>Project6.1 (/home/javvii/FreelanceProject/Project6.1): Connects strictly to Project6.1/data/kiosk.db and operates on the telegram-version branch.</w:t>
+        <w:t>Connects strictly to Project6.1/data/kiosk.db and operates on the telegram-version branch.</w:t>
       </w:r>
     </w:p>
     <w:p>
@@ -3282,7 +3568,7 @@
           <w:color w:val="000000"/>
           <w:sz w:val="22"/>
         </w:rPr>
-        <w:t xml:space="preserve">• </w:t>
+        <w:t xml:space="preserve">Zero TCP Port Conflicts: </w:t>
       </w:r>
       <w:r>
         <w:rPr>
@@ -3290,7 +3576,7 @@
           <w:color w:val="000000"/>
           <w:sz w:val="22"/>
         </w:rPr>
-        <w:t>Zero TCP Port Conflicts: Neither station uses listening TCP server sockets (all communication is mediated via local SQLite and outbound HTTPS clients). Both versions can run simultaneously on developer workstations or campus testing setups.</w:t>
+        <w:t>Neither station uses listening TCP server sockets (all communication is mediated via local SQLite and outbound HTTPS clients). Both versions can run simultaneously on developer workstations or campus testing setups.</w:t>
       </w:r>
     </w:p>
     <w:p>
@@ -5865,7 +6151,7 @@
           <w:color w:val="000000"/>
           <w:sz w:val="22"/>
         </w:rPr>
-        <w:t xml:space="preserve">• </w:t>
+        <w:t xml:space="preserve">telegram_enabled: </w:t>
       </w:r>
       <w:r>
         <w:rPr>
@@ -5873,7 +6159,7 @@
           <w:color w:val="000000"/>
           <w:sz w:val="22"/>
         </w:rPr>
-        <w:t>telegram_enabled: '1' (active) or '0' (disabled).</w:t>
+        <w:t>'1' (active) or '0' (disabled).</w:t>
       </w:r>
     </w:p>
     <w:p>
@@ -5888,7 +6174,7 @@
           <w:color w:val="000000"/>
           <w:sz w:val="22"/>
         </w:rPr>
-        <w:t xml:space="preserve">• </w:t>
+        <w:t xml:space="preserve">telegram_mock_mode: </w:t>
       </w:r>
       <w:r>
         <w:rPr>
@@ -5896,7 +6182,7 @@
           <w:color w:val="000000"/>
           <w:sz w:val="22"/>
         </w:rPr>
-        <w:t>telegram_mock_mode: '1' (local mock simulation) or '0' (live Telegram Bot API).</w:t>
+        <w:t>'1' (local mock simulation) or '0' (live Telegram Bot API).</w:t>
       </w:r>
     </w:p>
     <w:p>
@@ -5911,7 +6197,7 @@
           <w:color w:val="000000"/>
           <w:sz w:val="22"/>
         </w:rPr>
-        <w:t xml:space="preserve">• </w:t>
+        <w:t xml:space="preserve">telegram_bot_token: </w:t>
       </w:r>
       <w:r>
         <w:rPr>
@@ -5919,7 +6205,7 @@
           <w:color w:val="000000"/>
           <w:sz w:val="22"/>
         </w:rPr>
-        <w:t>telegram_bot_token: Bot token issued by @BotFather.</w:t>
+        <w:t>Bot token issued by @BotFather.</w:t>
       </w:r>
     </w:p>
     <w:p>
@@ -5934,7 +6220,7 @@
           <w:color w:val="000000"/>
           <w:sz w:val="22"/>
         </w:rPr>
-        <w:t xml:space="preserve">• </w:t>
+        <w:t xml:space="preserve">telegram_bot_username: </w:t>
       </w:r>
       <w:r>
         <w:rPr>
@@ -5942,7 +6228,7 @@
           <w:color w:val="000000"/>
           <w:sz w:val="22"/>
         </w:rPr>
-        <w:t>telegram_bot_username: Public bot handle (e.g. 'TapNQueBot').</w:t>
+        <w:t>Public bot handle (e.g. 'TapNQueBot').</w:t>
       </w:r>
     </w:p>
     <w:p>
@@ -5957,7 +6243,7 @@
           <w:color w:val="000000"/>
           <w:sz w:val="22"/>
         </w:rPr>
-        <w:t xml:space="preserve">• </w:t>
+        <w:t xml:space="preserve">telegram_template_created / telegram_template_called / telegram_template_completed: </w:t>
       </w:r>
       <w:r>
         <w:rPr>
@@ -5965,7 +6251,7 @@
           <w:color w:val="000000"/>
           <w:sz w:val="22"/>
         </w:rPr>
-        <w:t>telegram_template_created / telegram_template_called / telegram_template_completed: Custom notification message strings.</w:t>
+        <w:t>Custom notification message strings.</w:t>
       </w:r>
     </w:p>
     <w:sectPr>

</xml_diff>

<commit_message>
docs(guide): add hands-on Telegram Bot simulation walkthrough section to manual
</commit_message>
<xml_diff>
--- a/docs/11-09-2026_TapNQue_Comprehensive_System_Guide_and_Telegram_Bot_Manual.docx
+++ b/docs/11-09-2026_TapNQue_Comprehensive_System_Guide_and_Telegram_Bot_Manual.docx
@@ -29,7 +29,7 @@
           <w:color w:val="000000"/>
           <w:sz w:val="23"/>
         </w:rPr>
-        <w:t>Comprehensive System Architecture, Administrative Authentication Guide, and Telegram QR Bot API Operations Manual</w:t>
+        <w:t>Comprehensive System Architecture, Administrative Authentication Guide, Telegram QR Bot API Operations Manual, and Hands-On Simulation Walkthrough</w:t>
       </w:r>
     </w:p>
     <w:p>
@@ -99,7 +99,7 @@
     <w:p>
       <w:pPr>
         <w:keepNext/>
-        <w:spacing w:before="260" w:after="80"/>
+        <w:spacing w:before="280" w:after="80"/>
       </w:pPr>
       <w:r>
         <w:rPr>
@@ -946,7 +946,7 @@
     <w:p>
       <w:pPr>
         <w:keepNext/>
-        <w:spacing w:before="260" w:after="80"/>
+        <w:spacing w:before="280" w:after="80"/>
       </w:pPr>
       <w:r>
         <w:rPr>
@@ -1783,7 +1783,7 @@
     <w:p>
       <w:pPr>
         <w:keepNext/>
-        <w:spacing w:before="260" w:after="80"/>
+        <w:spacing w:before="280" w:after="80"/>
       </w:pPr>
       <w:r>
         <w:rPr>
@@ -2328,7 +2328,7 @@
     <w:p>
       <w:pPr>
         <w:keepNext/>
-        <w:spacing w:before="260" w:after="80"/>
+        <w:spacing w:before="280" w:after="80"/>
       </w:pPr>
       <w:r>
         <w:rPr>
@@ -3330,7 +3330,7 @@
     <w:p>
       <w:pPr>
         <w:keepNext/>
-        <w:spacing w:before="260" w:after="80"/>
+        <w:spacing w:before="280" w:after="80"/>
       </w:pPr>
       <w:r>
         <w:rPr>
@@ -3339,7 +3339,828 @@
           <w:color w:val="000000"/>
           <w:sz w:val="26"/>
         </w:rPr>
-        <w:t>5. Safe Capstone Mock Simulation Mode</w:t>
+        <w:t>5. Step-by-Step Hands-On Telegram Bot Simulation Walkthrough</w:t>
+      </w:r>
+    </w:p>
+    <w:p>
+      <w:pPr>
+        <w:spacing w:line="276" w:lineRule="auto" w:before="0" w:after="90"/>
+      </w:pPr>
+      <w:r>
+        <w:rPr>
+          <w:rFonts w:ascii="Times New Roman" w:hAnsi="Times New Roman"/>
+          <w:i w:val="0"/>
+          <w:color w:val="000000"/>
+          <w:sz w:val="22"/>
+        </w:rPr>
+        <w:t>To allow thesis panelists, faculty evaluators, and system administrators to verify the full Telegram QR Bot notification lifecycle without requiring a live public bot token or internet connection, execute the following structured hands-on walkthrough:</w:t>
+      </w:r>
+    </w:p>
+    <w:p>
+      <w:pPr>
+        <w:keepNext/>
+        <w:spacing w:before="180" w:after="60"/>
+      </w:pPr>
+      <w:r>
+        <w:rPr>
+          <w:rFonts w:ascii="Times New Roman" w:hAnsi="Times New Roman"/>
+          <w:b/>
+          <w:color w:val="000000"/>
+          <w:sz w:val="23"/>
+        </w:rPr>
+        <w:t>Phase 1: Verify Super Admin Settings &amp; On-Demand Test Dispatch</w:t>
+      </w:r>
+    </w:p>
+    <w:p>
+      <w:pPr>
+        <w:spacing w:line="276" w:lineRule="auto" w:before="0" w:after="70"/>
+        <w:ind w:left="504" w:hanging="504"/>
+      </w:pPr>
+      <w:r>
+        <w:rPr>
+          <w:rFonts w:ascii="Times New Roman" w:hAnsi="Times New Roman"/>
+          <w:b/>
+          <w:color w:val="000000"/>
+          <w:sz w:val="22"/>
+        </w:rPr>
+        <w:t>1.</w:t>
+        <w:tab/>
+      </w:r>
+      <w:r>
+        <w:rPr>
+          <w:rFonts w:ascii="Times New Roman" w:hAnsi="Times New Roman"/>
+          <w:b/>
+          <w:color w:val="000000"/>
+          <w:sz w:val="22"/>
+        </w:rPr>
+        <w:t xml:space="preserve">Launch Super Admin: </w:t>
+      </w:r>
+      <w:r>
+        <w:rPr>
+          <w:rFonts w:ascii="Times New Roman" w:hAnsi="Times New Roman"/>
+          <w:color w:val="000000"/>
+          <w:sz w:val="22"/>
+        </w:rPr>
+        <w:t>Launch the Super Admin Console: python run_admin.py (Credentials: Username admin, Password admin123).</w:t>
+      </w:r>
+    </w:p>
+    <w:p>
+      <w:pPr>
+        <w:spacing w:line="276" w:lineRule="auto" w:before="0" w:after="70"/>
+        <w:ind w:left="504" w:hanging="504"/>
+      </w:pPr>
+      <w:r>
+        <w:rPr>
+          <w:rFonts w:ascii="Times New Roman" w:hAnsi="Times New Roman"/>
+          <w:b/>
+          <w:color w:val="000000"/>
+          <w:sz w:val="22"/>
+        </w:rPr>
+        <w:t>2.</w:t>
+        <w:tab/>
+      </w:r>
+      <w:r>
+        <w:rPr>
+          <w:rFonts w:ascii="Times New Roman" w:hAnsi="Times New Roman"/>
+          <w:b/>
+          <w:color w:val="000000"/>
+          <w:sz w:val="22"/>
+        </w:rPr>
+        <w:t xml:space="preserve">Open Telegram Settings: </w:t>
+      </w:r>
+      <w:r>
+        <w:rPr>
+          <w:rFonts w:ascii="Times New Roman" w:hAnsi="Times New Roman"/>
+          <w:color w:val="000000"/>
+          <w:sz w:val="22"/>
+        </w:rPr>
+        <w:t>Navigate to the Settings tab and scroll to the Telegram QR Bot Subsystem group box.</w:t>
+      </w:r>
+    </w:p>
+    <w:p>
+      <w:pPr>
+        <w:spacing w:line="276" w:lineRule="auto" w:before="0" w:after="70"/>
+        <w:ind w:left="504" w:hanging="504"/>
+      </w:pPr>
+      <w:r>
+        <w:rPr>
+          <w:rFonts w:ascii="Times New Roman" w:hAnsi="Times New Roman"/>
+          <w:b/>
+          <w:color w:val="000000"/>
+          <w:sz w:val="22"/>
+        </w:rPr>
+        <w:t>3.</w:t>
+        <w:tab/>
+      </w:r>
+      <w:r>
+        <w:rPr>
+          <w:rFonts w:ascii="Times New Roman" w:hAnsi="Times New Roman"/>
+          <w:b/>
+          <w:color w:val="000000"/>
+          <w:sz w:val="22"/>
+        </w:rPr>
+        <w:t xml:space="preserve">Verify Mock Badge: </w:t>
+      </w:r>
+      <w:r>
+        <w:rPr>
+          <w:rFonts w:ascii="Times New Roman" w:hAnsi="Times New Roman"/>
+          <w:color w:val="000000"/>
+          <w:sz w:val="22"/>
+        </w:rPr>
+        <w:t>Confirm that the mode status badge indicates: ● MOCK MODE ACTIVE (Safe Capstone Simulation — Local Logging Only, No Telegram Dispatch).</w:t>
+      </w:r>
+    </w:p>
+    <w:p>
+      <w:pPr>
+        <w:spacing w:line="276" w:lineRule="auto" w:before="0" w:after="70"/>
+        <w:ind w:left="504" w:hanging="504"/>
+      </w:pPr>
+      <w:r>
+        <w:rPr>
+          <w:rFonts w:ascii="Times New Roman" w:hAnsi="Times New Roman"/>
+          <w:b/>
+          <w:color w:val="000000"/>
+          <w:sz w:val="22"/>
+        </w:rPr>
+        <w:t>4.</w:t>
+        <w:tab/>
+      </w:r>
+      <w:r>
+        <w:rPr>
+          <w:rFonts w:ascii="Times New Roman" w:hAnsi="Times New Roman"/>
+          <w:b/>
+          <w:color w:val="000000"/>
+          <w:sz w:val="22"/>
+        </w:rPr>
+        <w:t xml:space="preserve">Inspect QR Preview: </w:t>
+      </w:r>
+      <w:r>
+        <w:rPr>
+          <w:rFonts w:ascii="Times New Roman" w:hAnsi="Times New Roman"/>
+          <w:color w:val="000000"/>
+          <w:sz w:val="22"/>
+        </w:rPr>
+        <w:t>Confirm that the Bot Username field contains a handle (e.g. TapNQueQueueBot) and note the real-time QR code preview rendered adjacent to the credentials.</w:t>
+      </w:r>
+    </w:p>
+    <w:p>
+      <w:pPr>
+        <w:spacing w:line="276" w:lineRule="auto" w:before="0" w:after="70"/>
+        <w:ind w:left="504" w:hanging="504"/>
+      </w:pPr>
+      <w:r>
+        <w:rPr>
+          <w:rFonts w:ascii="Times New Roman" w:hAnsi="Times New Roman"/>
+          <w:b/>
+          <w:color w:val="000000"/>
+          <w:sz w:val="22"/>
+        </w:rPr>
+        <w:t>5.</w:t>
+        <w:tab/>
+      </w:r>
+      <w:r>
+        <w:rPr>
+          <w:rFonts w:ascii="Times New Roman" w:hAnsi="Times New Roman"/>
+          <w:b/>
+          <w:color w:val="000000"/>
+          <w:sz w:val="22"/>
+        </w:rPr>
+        <w:t xml:space="preserve">Execute Test Dispatch: </w:t>
+      </w:r>
+      <w:r>
+        <w:rPr>
+          <w:rFonts w:ascii="Times New Roman" w:hAnsi="Times New Roman"/>
+          <w:color w:val="000000"/>
+          <w:sz w:val="22"/>
+        </w:rPr>
+        <w:t>Click TEST TELEGRAM DISPATCH. In the modal, enter @maria_student (or numeric chat ID 123456789), and click SEND TEST MESSAGE.</w:t>
+      </w:r>
+    </w:p>
+    <w:p>
+      <w:pPr>
+        <w:spacing w:line="276" w:lineRule="auto" w:before="0" w:after="70"/>
+        <w:ind w:left="504" w:hanging="504"/>
+      </w:pPr>
+      <w:r>
+        <w:rPr>
+          <w:rFonts w:ascii="Times New Roman" w:hAnsi="Times New Roman"/>
+          <w:b/>
+          <w:color w:val="000000"/>
+          <w:sz w:val="22"/>
+        </w:rPr>
+        <w:t>6.</w:t>
+        <w:tab/>
+      </w:r>
+      <w:r>
+        <w:rPr>
+          <w:rFonts w:ascii="Times New Roman" w:hAnsi="Times New Roman"/>
+          <w:b/>
+          <w:color w:val="000000"/>
+          <w:sz w:val="22"/>
+        </w:rPr>
+        <w:t xml:space="preserve">Audit Simulation Dispatch: </w:t>
+      </w:r>
+      <w:r>
+        <w:rPr>
+          <w:rFonts w:ascii="Times New Roman" w:hAnsi="Times New Roman"/>
+          <w:color w:val="000000"/>
+          <w:sz w:val="22"/>
+        </w:rPr>
+        <w:t>Confirm the success notification appears. Click VIEW MOCK TELEGRAM LOGS to inspect the TelegramLogDialog audit table containing the recorded test entry with timestamp, recipient, and formatted markdown body.</w:t>
+      </w:r>
+    </w:p>
+    <w:p>
+      <w:pPr>
+        <w:keepNext/>
+        <w:spacing w:before="180" w:after="60"/>
+      </w:pPr>
+      <w:r>
+        <w:rPr>
+          <w:rFonts w:ascii="Times New Roman" w:hAnsi="Times New Roman"/>
+          <w:b/>
+          <w:color w:val="000000"/>
+          <w:sz w:val="23"/>
+        </w:rPr>
+        <w:t>Phase 2: Generate Ticket on Student Kiosk with QR Deep-Link (Trigger 1: CREATED)</w:t>
+      </w:r>
+    </w:p>
+    <w:p>
+      <w:pPr>
+        <w:spacing w:line="276" w:lineRule="auto" w:before="0" w:after="70"/>
+        <w:ind w:left="504" w:hanging="504"/>
+      </w:pPr>
+      <w:r>
+        <w:rPr>
+          <w:rFonts w:ascii="Times New Roman" w:hAnsi="Times New Roman"/>
+          <w:b/>
+          <w:color w:val="000000"/>
+          <w:sz w:val="22"/>
+        </w:rPr>
+        <w:t>1.</w:t>
+        <w:tab/>
+      </w:r>
+      <w:r>
+        <w:rPr>
+          <w:rFonts w:ascii="Times New Roman" w:hAnsi="Times New Roman"/>
+          <w:b/>
+          <w:color w:val="000000"/>
+          <w:sz w:val="22"/>
+        </w:rPr>
+        <w:t xml:space="preserve">Launch Kiosk Station: </w:t>
+      </w:r>
+      <w:r>
+        <w:rPr>
+          <w:rFonts w:ascii="Times New Roman" w:hAnsi="Times New Roman"/>
+          <w:color w:val="000000"/>
+          <w:sz w:val="22"/>
+        </w:rPr>
+        <w:t>In a separate terminal, launch the Student Kiosk terminal: python run_kiosk.py.</w:t>
+      </w:r>
+    </w:p>
+    <w:p>
+      <w:pPr>
+        <w:spacing w:line="276" w:lineRule="auto" w:before="0" w:after="70"/>
+        <w:ind w:left="504" w:hanging="504"/>
+      </w:pPr>
+      <w:r>
+        <w:rPr>
+          <w:rFonts w:ascii="Times New Roman" w:hAnsi="Times New Roman"/>
+          <w:b/>
+          <w:color w:val="000000"/>
+          <w:sz w:val="22"/>
+        </w:rPr>
+        <w:t>2.</w:t>
+        <w:tab/>
+      </w:r>
+      <w:r>
+        <w:rPr>
+          <w:rFonts w:ascii="Times New Roman" w:hAnsi="Times New Roman"/>
+          <w:b/>
+          <w:color w:val="000000"/>
+          <w:sz w:val="22"/>
+        </w:rPr>
+        <w:t xml:space="preserve">Enter Student Information: </w:t>
+      </w:r>
+      <w:r>
+        <w:rPr>
+          <w:rFonts w:ascii="Times New Roman" w:hAnsi="Times New Roman"/>
+          <w:color w:val="000000"/>
+          <w:sz w:val="22"/>
+        </w:rPr>
+        <w:t>On the touchscreen check-in form, enter the following demonstration student profile:</w:t>
+        <w:br/>
+        <w:t>• Student Full Name: Maria Santos</w:t>
+        <w:br/>
+        <w:t>• Student Identification Number: 2023-20055</w:t>
+        <w:br/>
+        <w:t>• Email Address: maria@olfu.edu.ph</w:t>
+        <w:br/>
+        <w:t>• Mobile Number: 0918 123 4567</w:t>
+        <w:br/>
+        <w:t>• Telegram Username: @maria_student</w:t>
+        <w:br/>
+        <w:t>• Visitor Classification: Student</w:t>
+        <w:br/>
+        <w:t>• Purpose of Visit: Registrar - Transcript</w:t>
+      </w:r>
+    </w:p>
+    <w:p>
+      <w:pPr>
+        <w:spacing w:line="276" w:lineRule="auto" w:before="0" w:after="70"/>
+        <w:ind w:left="504" w:hanging="504"/>
+      </w:pPr>
+      <w:r>
+        <w:rPr>
+          <w:rFonts w:ascii="Times New Roman" w:hAnsi="Times New Roman"/>
+          <w:b/>
+          <w:color w:val="000000"/>
+          <w:sz w:val="22"/>
+        </w:rPr>
+        <w:t>3.</w:t>
+        <w:tab/>
+      </w:r>
+      <w:r>
+        <w:rPr>
+          <w:rFonts w:ascii="Times New Roman" w:hAnsi="Times New Roman"/>
+          <w:b/>
+          <w:color w:val="000000"/>
+          <w:sz w:val="22"/>
+        </w:rPr>
+        <w:t xml:space="preserve">Submit Registration: </w:t>
+      </w:r>
+      <w:r>
+        <w:rPr>
+          <w:rFonts w:ascii="Times New Roman" w:hAnsi="Times New Roman"/>
+          <w:color w:val="000000"/>
+          <w:sz w:val="22"/>
+        </w:rPr>
+        <w:t>Click the prominent green GET TICKET button.</w:t>
+      </w:r>
+    </w:p>
+    <w:p>
+      <w:pPr>
+        <w:spacing w:line="276" w:lineRule="auto" w:before="0" w:after="70"/>
+        <w:ind w:left="504" w:hanging="504"/>
+      </w:pPr>
+      <w:r>
+        <w:rPr>
+          <w:rFonts w:ascii="Times New Roman" w:hAnsi="Times New Roman"/>
+          <w:b/>
+          <w:color w:val="000000"/>
+          <w:sz w:val="22"/>
+        </w:rPr>
+        <w:t>4.</w:t>
+        <w:tab/>
+      </w:r>
+      <w:r>
+        <w:rPr>
+          <w:rFonts w:ascii="Times New Roman" w:hAnsi="Times New Roman"/>
+          <w:b/>
+          <w:color w:val="000000"/>
+          <w:sz w:val="22"/>
+        </w:rPr>
+        <w:t xml:space="preserve">Inspect QR Confirmation Dialog: </w:t>
+      </w:r>
+      <w:r>
+        <w:rPr>
+          <w:rFonts w:ascii="Times New Roman" w:hAnsi="Times New Roman"/>
+          <w:color w:val="000000"/>
+          <w:sz w:val="22"/>
+        </w:rPr>
+        <w:t>The high-resolution TicketCreatedDialog modal appears displaying:</w:t>
+        <w:br/>
+        <w:t>• Sequential Ticket Number #0001.</w:t>
+        <w:br/>
+        <w:t>• Dynamic QR code encoding https://t.me/&lt;bot_username&gt;?start=ticket_0001.</w:t>
+        <w:br/>
+        <w:t>• Instructional banner: 'Scan QR code with smartphone camera or Telegram app to receive queue updates!'.</w:t>
+        <w:br/>
+        <w:t>• Status confirmation pill: 'Telegram notification dispatched'.</w:t>
+      </w:r>
+    </w:p>
+    <w:p>
+      <w:pPr>
+        <w:spacing w:line="276" w:lineRule="auto" w:before="0" w:after="70"/>
+        <w:ind w:left="504" w:hanging="504"/>
+      </w:pPr>
+      <w:r>
+        <w:rPr>
+          <w:rFonts w:ascii="Times New Roman" w:hAnsi="Times New Roman"/>
+          <w:b/>
+          <w:color w:val="000000"/>
+          <w:sz w:val="22"/>
+        </w:rPr>
+        <w:t>5.</w:t>
+        <w:tab/>
+      </w:r>
+      <w:r>
+        <w:rPr>
+          <w:rFonts w:ascii="Times New Roman" w:hAnsi="Times New Roman"/>
+          <w:b/>
+          <w:color w:val="000000"/>
+          <w:sz w:val="22"/>
+        </w:rPr>
+        <w:t xml:space="preserve">Verify Daemon Output: </w:t>
+      </w:r>
+      <w:r>
+        <w:rPr>
+          <w:rFonts w:ascii="Times New Roman" w:hAnsi="Times New Roman"/>
+          <w:color w:val="000000"/>
+          <w:sz w:val="22"/>
+        </w:rPr>
+        <w:t>Switch to the Kiosk terminal console to observe the asynchronous daemon log output:</w:t>
+        <w:br/>
+        <w:t>✈️ [TELEGRAM BOT SIMULATION] To: @maria_student | Event: CREATED | Ticket: #0001</w:t>
+        <w:br/>
+        <w:t xml:space="preserve">   "🎫 *TICKET CONFIRMED*</w:t>
+        <w:br/>
+        <w:br/>
+        <w:t xml:space="preserve">   Hello *Maria Santos*! Your ticket *#0001* has been registered.</w:t>
+        <w:br/>
+        <w:t xml:space="preserve">   • Queue Position: *1*</w:t>
+        <w:br/>
+        <w:t xml:space="preserve">   • Purpose: *Registrar - Transcript*</w:t>
+        <w:br/>
+        <w:br/>
+        <w:t xml:space="preserve">   _TapNQue Student Queue Management_"</w:t>
+      </w:r>
+    </w:p>
+    <w:p>
+      <w:pPr>
+        <w:keepNext/>
+        <w:spacing w:before="180" w:after="60"/>
+      </w:pPr>
+      <w:r>
+        <w:rPr>
+          <w:rFonts w:ascii="Times New Roman" w:hAnsi="Times New Roman"/>
+          <w:b/>
+          <w:color w:val="000000"/>
+          <w:sz w:val="23"/>
+        </w:rPr>
+        <w:t>Phase 3: Service Ticket at Staff Service Desk (Trigger 2: CALLED &amp; Trigger 3: COMPLETED)</w:t>
+      </w:r>
+    </w:p>
+    <w:p>
+      <w:pPr>
+        <w:spacing w:line="276" w:lineRule="auto" w:before="0" w:after="70"/>
+        <w:ind w:left="504" w:hanging="504"/>
+      </w:pPr>
+      <w:r>
+        <w:rPr>
+          <w:rFonts w:ascii="Times New Roman" w:hAnsi="Times New Roman"/>
+          <w:b/>
+          <w:color w:val="000000"/>
+          <w:sz w:val="22"/>
+        </w:rPr>
+        <w:t>1.</w:t>
+        <w:tab/>
+      </w:r>
+      <w:r>
+        <w:rPr>
+          <w:rFonts w:ascii="Times New Roman" w:hAnsi="Times New Roman"/>
+          <w:b/>
+          <w:color w:val="000000"/>
+          <w:sz w:val="22"/>
+        </w:rPr>
+        <w:t xml:space="preserve">Launch Staff Service Desk: </w:t>
+      </w:r>
+      <w:r>
+        <w:rPr>
+          <w:rFonts w:ascii="Times New Roman" w:hAnsi="Times New Roman"/>
+          <w:color w:val="000000"/>
+          <w:sz w:val="22"/>
+        </w:rPr>
+        <w:t>In a third terminal window, launch the Staff Admin interface: python run_staff.py (Credentials: Username staff, Password staff123).</w:t>
+      </w:r>
+    </w:p>
+    <w:p>
+      <w:pPr>
+        <w:spacing w:line="276" w:lineRule="auto" w:before="0" w:after="70"/>
+        <w:ind w:left="504" w:hanging="504"/>
+      </w:pPr>
+      <w:r>
+        <w:rPr>
+          <w:rFonts w:ascii="Times New Roman" w:hAnsi="Times New Roman"/>
+          <w:b/>
+          <w:color w:val="000000"/>
+          <w:sz w:val="22"/>
+        </w:rPr>
+        <w:t>2.</w:t>
+        <w:tab/>
+      </w:r>
+      <w:r>
+        <w:rPr>
+          <w:rFonts w:ascii="Times New Roman" w:hAnsi="Times New Roman"/>
+          <w:b/>
+          <w:color w:val="000000"/>
+          <w:sz w:val="22"/>
+        </w:rPr>
+        <w:t xml:space="preserve">Inspect Waiting Queue: </w:t>
+      </w:r>
+      <w:r>
+        <w:rPr>
+          <w:rFonts w:ascii="Times New Roman" w:hAnsi="Times New Roman"/>
+          <w:color w:val="000000"/>
+          <w:sz w:val="22"/>
+        </w:rPr>
+        <w:t>Select Counter 1. Observe Ticket #0001 (Maria Santos) positioned at the head of the priority queue table.</w:t>
+      </w:r>
+    </w:p>
+    <w:p>
+      <w:pPr>
+        <w:spacing w:line="276" w:lineRule="auto" w:before="0" w:after="70"/>
+        <w:ind w:left="504" w:hanging="504"/>
+      </w:pPr>
+      <w:r>
+        <w:rPr>
+          <w:rFonts w:ascii="Times New Roman" w:hAnsi="Times New Roman"/>
+          <w:b/>
+          <w:color w:val="000000"/>
+          <w:sz w:val="22"/>
+        </w:rPr>
+        <w:t>3.</w:t>
+        <w:tab/>
+      </w:r>
+      <w:r>
+        <w:rPr>
+          <w:rFonts w:ascii="Times New Roman" w:hAnsi="Times New Roman"/>
+          <w:b/>
+          <w:color w:val="000000"/>
+          <w:sz w:val="22"/>
+        </w:rPr>
+        <w:t xml:space="preserve">Trigger Called Alert: </w:t>
+      </w:r>
+      <w:r>
+        <w:rPr>
+          <w:rFonts w:ascii="Times New Roman" w:hAnsi="Times New Roman"/>
+          <w:color w:val="000000"/>
+          <w:sz w:val="22"/>
+        </w:rPr>
+        <w:t>Click CALL NEXT (Trigger 2):</w:t>
+        <w:br/>
+        <w:t>• The Active Serving Card illuminates with Ticket #0001 assigned to Counter 1.</w:t>
+        <w:br/>
+        <w:t>• The public lobby display board triggers visual flash highlights and acoustic attention cues.</w:t>
+        <w:br/>
+        <w:t>• The terminal console outputs the outbound Telegram dispatch:</w:t>
+        <w:br/>
+        <w:t xml:space="preserve">  ✈️ [TELEGRAM BOT SIMULATION] To: @maria_student | Event: CALLED | Ticket: #0001</w:t>
+        <w:br/>
+        <w:t xml:space="preserve">     "🔔 *NOW SERVING ALERT*</w:t>
+        <w:br/>
+        <w:br/>
+        <w:t xml:space="preserve">     Ticket *#0001* (*Maria Santos*), please proceed to *Counter 1* immediately!</w:t>
+        <w:br/>
+        <w:br/>
+        <w:t xml:space="preserve">     _TapNQue Student Queue Management_"</w:t>
+      </w:r>
+    </w:p>
+    <w:p>
+      <w:pPr>
+        <w:spacing w:line="276" w:lineRule="auto" w:before="0" w:after="70"/>
+        <w:ind w:left="504" w:hanging="504"/>
+      </w:pPr>
+      <w:r>
+        <w:rPr>
+          <w:rFonts w:ascii="Times New Roman" w:hAnsi="Times New Roman"/>
+          <w:b/>
+          <w:color w:val="000000"/>
+          <w:sz w:val="22"/>
+        </w:rPr>
+        <w:t>4.</w:t>
+        <w:tab/>
+      </w:r>
+      <w:r>
+        <w:rPr>
+          <w:rFonts w:ascii="Times New Roman" w:hAnsi="Times New Roman"/>
+          <w:b/>
+          <w:color w:val="000000"/>
+          <w:sz w:val="22"/>
+        </w:rPr>
+        <w:t xml:space="preserve">Test Absentee Recall: </w:t>
+      </w:r>
+      <w:r>
+        <w:rPr>
+          <w:rFonts w:ascii="Times New Roman" w:hAnsi="Times New Roman"/>
+          <w:color w:val="000000"/>
+          <w:sz w:val="22"/>
+        </w:rPr>
+        <w:t>(Optional Recall Verification): Click the RECALL button. Confirm that the lobby display pulses visual animations and a renewed Telegram notification is logged to the console.</w:t>
+      </w:r>
+    </w:p>
+    <w:p>
+      <w:pPr>
+        <w:spacing w:line="276" w:lineRule="auto" w:before="0" w:after="70"/>
+        <w:ind w:left="504" w:hanging="504"/>
+      </w:pPr>
+      <w:r>
+        <w:rPr>
+          <w:rFonts w:ascii="Times New Roman" w:hAnsi="Times New Roman"/>
+          <w:b/>
+          <w:color w:val="000000"/>
+          <w:sz w:val="22"/>
+        </w:rPr>
+        <w:t>5.</w:t>
+        <w:tab/>
+      </w:r>
+      <w:r>
+        <w:rPr>
+          <w:rFonts w:ascii="Times New Roman" w:hAnsi="Times New Roman"/>
+          <w:b/>
+          <w:color w:val="000000"/>
+          <w:sz w:val="22"/>
+        </w:rPr>
+        <w:t xml:space="preserve">Trigger Completed Alert: </w:t>
+      </w:r>
+      <w:r>
+        <w:rPr>
+          <w:rFonts w:ascii="Times New Roman" w:hAnsi="Times New Roman"/>
+          <w:color w:val="000000"/>
+          <w:sz w:val="22"/>
+        </w:rPr>
+        <w:t>Click MARK DONE (Trigger 3):</w:t>
+        <w:br/>
+        <w:t>• The transaction is finalized, wait duration is logged, and the ticket moves to history.</w:t>
+        <w:br/>
+        <w:t>• The terminal console outputs the final completion message:</w:t>
+        <w:br/>
+        <w:t xml:space="preserve">  ✈️ [TELEGRAM BOT SIMULATION] To: @maria_student | Event: COMPLETED | Ticket: #0001</w:t>
+        <w:br/>
+        <w:t xml:space="preserve">     "✅ *SERVICE COMPLETED*</w:t>
+        <w:br/>
+        <w:br/>
+        <w:t xml:space="preserve">     Ticket *#0001* has been completed at *Counter 1*.</w:t>
+        <w:br/>
+        <w:t xml:space="preserve">     Thank you for visiting TapNQue!</w:t>
+        <w:br/>
+        <w:br/>
+        <w:t xml:space="preserve">     _TapNQue Student Queue Management_"</w:t>
+      </w:r>
+    </w:p>
+    <w:p>
+      <w:pPr>
+        <w:keepNext/>
+        <w:spacing w:before="180" w:after="60"/>
+      </w:pPr>
+      <w:r>
+        <w:rPr>
+          <w:rFonts w:ascii="Times New Roman" w:hAnsi="Times New Roman"/>
+          <w:b/>
+          <w:color w:val="000000"/>
+          <w:sz w:val="23"/>
+        </w:rPr>
+        <w:t>Phase 4: Verify Audit Trail &amp; Database Records in SQLite</w:t>
+      </w:r>
+    </w:p>
+    <w:p>
+      <w:pPr>
+        <w:spacing w:line="276" w:lineRule="auto" w:before="0" w:after="70"/>
+        <w:ind w:left="504" w:hanging="504"/>
+      </w:pPr>
+      <w:r>
+        <w:rPr>
+          <w:rFonts w:ascii="Times New Roman" w:hAnsi="Times New Roman"/>
+          <w:b/>
+          <w:color w:val="000000"/>
+          <w:sz w:val="22"/>
+        </w:rPr>
+        <w:t>1.</w:t>
+        <w:tab/>
+      </w:r>
+      <w:r>
+        <w:rPr>
+          <w:rFonts w:ascii="Times New Roman" w:hAnsi="Times New Roman"/>
+          <w:b/>
+          <w:color w:val="000000"/>
+          <w:sz w:val="22"/>
+        </w:rPr>
+        <w:t xml:space="preserve">Open Audit Modal: </w:t>
+      </w:r>
+      <w:r>
+        <w:rPr>
+          <w:rFonts w:ascii="Times New Roman" w:hAnsi="Times New Roman"/>
+          <w:color w:val="000000"/>
+          <w:sz w:val="22"/>
+        </w:rPr>
+        <w:t>Return to Super Admin &gt; Settings &gt; click VIEW MOCK TELEGRAM LOGS.</w:t>
+      </w:r>
+    </w:p>
+    <w:p>
+      <w:pPr>
+        <w:spacing w:line="276" w:lineRule="auto" w:before="0" w:after="70"/>
+        <w:ind w:left="504" w:hanging="504"/>
+      </w:pPr>
+      <w:r>
+        <w:rPr>
+          <w:rFonts w:ascii="Times New Roman" w:hAnsi="Times New Roman"/>
+          <w:b/>
+          <w:color w:val="000000"/>
+          <w:sz w:val="22"/>
+        </w:rPr>
+        <w:t>2.</w:t>
+        <w:tab/>
+      </w:r>
+      <w:r>
+        <w:rPr>
+          <w:rFonts w:ascii="Times New Roman" w:hAnsi="Times New Roman"/>
+          <w:b/>
+          <w:color w:val="000000"/>
+          <w:sz w:val="22"/>
+        </w:rPr>
+        <w:t xml:space="preserve">Verify GUI Audit Log: </w:t>
+      </w:r>
+      <w:r>
+        <w:rPr>
+          <w:rFonts w:ascii="Times New Roman" w:hAnsi="Times New Roman"/>
+          <w:color w:val="000000"/>
+          <w:sz w:val="22"/>
+        </w:rPr>
+        <w:t>Review the interactive audit table. Confirm all three transaction dispatches (CREATED, CALLED, COMPLETED) are chronologically documented with exact timestamps, recipient handles (@maria_student), and full Markdown formatting.</w:t>
+      </w:r>
+    </w:p>
+    <w:p>
+      <w:pPr>
+        <w:spacing w:line="276" w:lineRule="auto" w:before="0" w:after="70"/>
+        <w:ind w:left="504" w:hanging="504"/>
+      </w:pPr>
+      <w:r>
+        <w:rPr>
+          <w:rFonts w:ascii="Times New Roman" w:hAnsi="Times New Roman"/>
+          <w:b/>
+          <w:color w:val="000000"/>
+          <w:sz w:val="22"/>
+        </w:rPr>
+        <w:t>3.</w:t>
+        <w:tab/>
+      </w:r>
+      <w:r>
+        <w:rPr>
+          <w:rFonts w:ascii="Times New Roman" w:hAnsi="Times New Roman"/>
+          <w:b/>
+          <w:color w:val="000000"/>
+          <w:sz w:val="22"/>
+        </w:rPr>
+        <w:t xml:space="preserve">Verify Database Records: </w:t>
+      </w:r>
+      <w:r>
+        <w:rPr>
+          <w:rFonts w:ascii="Times New Roman" w:hAnsi="Times New Roman"/>
+          <w:color w:val="000000"/>
+          <w:sz w:val="22"/>
+        </w:rPr>
+        <w:t>Query the local SQLite database from a terminal to verify thread-safe persistence:</w:t>
+        <w:br/>
+        <w:t>python -c "import sqlite3; conn = sqlite3.connect('data/kiosk.db'); print(conn.execute('SELECT ticket_number, telegram_chat_id, telegram_status_created, telegram_status_called, telegram_status_completed FROM tickets WHERE ticket_number=1').fetchone())"</w:t>
+      </w:r>
+    </w:p>
+    <w:p>
+      <w:pPr>
+        <w:spacing w:line="276" w:lineRule="auto" w:before="0" w:after="70"/>
+        <w:ind w:left="504" w:hanging="504"/>
+      </w:pPr>
+      <w:r>
+        <w:rPr>
+          <w:rFonts w:ascii="Times New Roman" w:hAnsi="Times New Roman"/>
+          <w:b/>
+          <w:color w:val="000000"/>
+          <w:sz w:val="22"/>
+        </w:rPr>
+        <w:t>4.</w:t>
+        <w:tab/>
+      </w:r>
+      <w:r>
+        <w:rPr>
+          <w:rFonts w:ascii="Times New Roman" w:hAnsi="Times New Roman"/>
+          <w:b/>
+          <w:color w:val="000000"/>
+          <w:sz w:val="22"/>
+        </w:rPr>
+        <w:t xml:space="preserve">Inspect Database Result: </w:t>
+      </w:r>
+      <w:r>
+        <w:rPr>
+          <w:rFonts w:ascii="Times New Roman" w:hAnsi="Times New Roman"/>
+          <w:color w:val="000000"/>
+          <w:sz w:val="22"/>
+        </w:rPr>
+        <w:t>Confirm terminal query output returns:</w:t>
+        <w:br/>
+        <w:t>(1, '@maria_student', 'mock_sent', 'mock_sent', 'mock_sent')</w:t>
+      </w:r>
+    </w:p>
+    <w:p>
+      <w:pPr>
+        <w:keepNext/>
+        <w:spacing w:before="280" w:after="80"/>
+      </w:pPr>
+      <w:r>
+        <w:rPr>
+          <w:rFonts w:ascii="Times New Roman" w:hAnsi="Times New Roman"/>
+          <w:b/>
+          <w:color w:val="000000"/>
+          <w:sz w:val="26"/>
+        </w:rPr>
+        <w:t>6. Safe Capstone Mock Simulation Mode</w:t>
       </w:r>
     </w:p>
     <w:p>
@@ -3455,7 +4276,7 @@
     <w:p>
       <w:pPr>
         <w:keepNext/>
-        <w:spacing w:before="260" w:after="80"/>
+        <w:spacing w:before="280" w:after="80"/>
       </w:pPr>
       <w:r>
         <w:rPr>
@@ -3464,7 +4285,7 @@
           <w:color w:val="000000"/>
           <w:sz w:val="26"/>
         </w:rPr>
-        <w:t>6. Simultaneous Coexistence Guarantee &amp; Deployment Guide</w:t>
+        <w:t>7. Simultaneous Coexistence Guarantee &amp; Deployment Guide</w:t>
       </w:r>
     </w:p>
     <w:p>
@@ -3493,7 +4314,7 @@
           <w:color w:val="000000"/>
           <w:sz w:val="23"/>
         </w:rPr>
-        <w:t>6.1 Dual-Directory Coexistence Guarantee</w:t>
+        <w:t>7.1 Dual-Directory Coexistence Guarantee</w:t>
       </w:r>
     </w:p>
     <w:p>
@@ -3591,7 +4412,7 @@
           <w:color w:val="000000"/>
           <w:sz w:val="23"/>
         </w:rPr>
-        <w:t>6.2 Station Launch Reference</w:t>
+        <w:t>7.2 Station Launch Reference</w:t>
       </w:r>
     </w:p>
     <w:tbl>
@@ -4133,7 +4954,7 @@
     <w:p>
       <w:pPr>
         <w:keepNext/>
-        <w:spacing w:before="260" w:after="80"/>
+        <w:spacing w:before="280" w:after="80"/>
       </w:pPr>
       <w:r>
         <w:rPr>
@@ -4142,7 +4963,7 @@
           <w:color w:val="000000"/>
           <w:sz w:val="26"/>
         </w:rPr>
-        <w:t>7. Database Schema &amp; Data Dictionary</w:t>
+        <w:t>8. Database Schema &amp; Data Dictionary</w:t>
       </w:r>
     </w:p>
     <w:p>
@@ -4171,7 +4992,7 @@
           <w:color w:val="000000"/>
           <w:sz w:val="23"/>
         </w:rPr>
-        <w:t>7.1 Tickets Table Schema (Telegram Extensions)</w:t>
+        <w:t>8.1 Tickets Table Schema (Telegram Extensions)</w:t>
       </w:r>
     </w:p>
     <w:tbl>
@@ -6122,7 +6943,7 @@
           <w:color w:val="000000"/>
           <w:sz w:val="23"/>
         </w:rPr>
-        <w:t>7.2 Settings Table Schema (Telegram Extensions)</w:t>
+        <w:t>8.2 Settings Table Schema (Telegram Extensions)</w:t>
       </w:r>
     </w:p>
     <w:p>
@@ -6279,7 +7100,7 @@
         <w:color w:val="000000"/>
         <w:sz w:val="18"/>
       </w:rPr>
-      <w:t>TapNQue • Telegram QR Bot API System Guide (Doc ID: TNQ-DOC-MAN-2026-03-TELEGRAM)</w:t>
+      <w:t>TapNQue • Telegram QR Bot API System Guide &amp; Walkthrough Manual (Doc ID: TNQ-DOC-MAN-2026-03-TELEGRAM)</w:t>
     </w:r>
   </w:p>
 </w:ftr>

</xml_diff>

<commit_message>
docs(guide): adapt walkthrough to live Telegram Bot API testing with real QR deep-link
</commit_message>
<xml_diff>
--- a/docs/11-09-2026_TapNQue_Comprehensive_System_Guide_and_Telegram_Bot_Manual.docx
+++ b/docs/11-09-2026_TapNQue_Comprehensive_System_Guide_and_Telegram_Bot_Manual.docx
@@ -29,7 +29,7 @@
           <w:color w:val="000000"/>
           <w:sz w:val="23"/>
         </w:rPr>
-        <w:t>Comprehensive System Architecture, Administrative Authentication Guide, Telegram QR Bot API Operations Manual, and Hands-On Simulation Walkthrough</w:t>
+        <w:t>Comprehensive System Architecture, Administrative Authentication Guide, Telegram QR Bot API Operations Manual, and Hands-On Live Testing Walkthrough</w:t>
       </w:r>
     </w:p>
     <w:p>
@@ -3339,7 +3339,7 @@
           <w:color w:val="000000"/>
           <w:sz w:val="26"/>
         </w:rPr>
-        <w:t>5. Step-by-Step Hands-On Telegram Bot Simulation Walkthrough</w:t>
+        <w:t>5. Step-by-Step Hands-On Telegram Bot Live Testing Walkthrough</w:t>
       </w:r>
     </w:p>
     <w:p>
@@ -3353,7 +3353,7 @@
           <w:color w:val="000000"/>
           <w:sz w:val="22"/>
         </w:rPr>
-        <w:t>To allow thesis panelists, faculty evaluators, and system administrators to verify the full Telegram QR Bot notification lifecycle without requiring a live public bot token or internet connection, execute the following structured hands-on walkthrough:</w:t>
+        <w:t>This section provides an end-to-end, hands-on live testing walkthrough using the official Telegram Bot API to verify real-time push notifications and QR code deep-linking across smartphones and desktop clients:</w:t>
       </w:r>
     </w:p>
     <w:p>
@@ -3368,7 +3368,7 @@
           <w:color w:val="000000"/>
           <w:sz w:val="23"/>
         </w:rPr>
-        <w:t>Phase 1: Verify Super Admin Settings &amp; On-Demand Test Dispatch</w:t>
+        <w:t>Phase 1: Configure Super Admin for Live Telegram Dispatches &amp; Test Message</w:t>
       </w:r>
     </w:p>
     <w:p>
@@ -3384,6 +3384,39 @@
           <w:sz w:val="22"/>
         </w:rPr>
         <w:t>1.</w:t>
+        <w:tab/>
+      </w:r>
+      <w:r>
+        <w:rPr>
+          <w:rFonts w:ascii="Times New Roman" w:hAnsi="Times New Roman"/>
+          <w:b/>
+          <w:color w:val="000000"/>
+          <w:sz w:val="22"/>
+        </w:rPr>
+        <w:t xml:space="preserve">Obtain Credentials: </w:t>
+      </w:r>
+      <w:r>
+        <w:rPr>
+          <w:rFonts w:ascii="Times New Roman" w:hAnsi="Times New Roman"/>
+          <w:color w:val="000000"/>
+          <w:sz w:val="22"/>
+        </w:rPr>
+        <w:t>Ensure you have created your bot via @BotFather and obtained your HTTP API token and bot username.</w:t>
+      </w:r>
+    </w:p>
+    <w:p>
+      <w:pPr>
+        <w:spacing w:line="276" w:lineRule="auto" w:before="0" w:after="70"/>
+        <w:ind w:left="504" w:hanging="504"/>
+      </w:pPr>
+      <w:r>
+        <w:rPr>
+          <w:rFonts w:ascii="Times New Roman" w:hAnsi="Times New Roman"/>
+          <w:b/>
+          <w:color w:val="000000"/>
+          <w:sz w:val="22"/>
+        </w:rPr>
+        <w:t>2.</w:t>
         <w:tab/>
       </w:r>
       <w:r>
@@ -3416,7 +3449,7 @@
           <w:color w:val="000000"/>
           <w:sz w:val="22"/>
         </w:rPr>
-        <w:t>2.</w:t>
+        <w:t>3.</w:t>
         <w:tab/>
       </w:r>
       <w:r>
@@ -3434,40 +3467,7 @@
           <w:color w:val="000000"/>
           <w:sz w:val="22"/>
         </w:rPr>
-        <w:t>Navigate to the Settings tab and scroll to the Telegram QR Bot Subsystem group box.</w:t>
-      </w:r>
-    </w:p>
-    <w:p>
-      <w:pPr>
-        <w:spacing w:line="276" w:lineRule="auto" w:before="0" w:after="70"/>
-        <w:ind w:left="504" w:hanging="504"/>
-      </w:pPr>
-      <w:r>
-        <w:rPr>
-          <w:rFonts w:ascii="Times New Roman" w:hAnsi="Times New Roman"/>
-          <w:b/>
-          <w:color w:val="000000"/>
-          <w:sz w:val="22"/>
-        </w:rPr>
-        <w:t>3.</w:t>
-        <w:tab/>
-      </w:r>
-      <w:r>
-        <w:rPr>
-          <w:rFonts w:ascii="Times New Roman" w:hAnsi="Times New Roman"/>
-          <w:b/>
-          <w:color w:val="000000"/>
-          <w:sz w:val="22"/>
-        </w:rPr>
-        <w:t xml:space="preserve">Verify Mock Badge: </w:t>
-      </w:r>
-      <w:r>
-        <w:rPr>
-          <w:rFonts w:ascii="Times New Roman" w:hAnsi="Times New Roman"/>
-          <w:color w:val="000000"/>
-          <w:sz w:val="22"/>
-        </w:rPr>
-        <w:t>Confirm that the mode status badge indicates: ● MOCK MODE ACTIVE (Safe Capstone Simulation — Local Logging Only, No Telegram Dispatch).</w:t>
+        <w:t>Navigate to the Settings tab and scroll to the Telegram QR Bot Subsystem section.</w:t>
       </w:r>
     </w:p>
     <w:p>
@@ -3492,7 +3492,7 @@
           <w:color w:val="000000"/>
           <w:sz w:val="22"/>
         </w:rPr>
-        <w:t xml:space="preserve">Inspect QR Preview: </w:t>
+        <w:t xml:space="preserve">Input Credentials: </w:t>
       </w:r>
       <w:r>
         <w:rPr>
@@ -3500,7 +3500,7 @@
           <w:color w:val="000000"/>
           <w:sz w:val="22"/>
         </w:rPr>
-        <w:t>Confirm that the Bot Username field contains a handle (e.g. TapNQueQueueBot) and note the real-time QR code preview rendered adjacent to the credentials.</w:t>
+        <w:t>Paste your token into the Telegram Bot Token field and your username into Telegram Bot Username (e.g., TapNQueQueueBot).</w:t>
       </w:r>
     </w:p>
     <w:p>
@@ -3525,7 +3525,7 @@
           <w:color w:val="000000"/>
           <w:sz w:val="22"/>
         </w:rPr>
-        <w:t xml:space="preserve">Execute Test Dispatch: </w:t>
+        <w:t xml:space="preserve">Activate Live Bot Mode: </w:t>
       </w:r>
       <w:r>
         <w:rPr>
@@ -3533,7 +3533,7 @@
           <w:color w:val="000000"/>
           <w:sz w:val="22"/>
         </w:rPr>
-        <w:t>Click TEST TELEGRAM DISPATCH. In the modal, enter @maria_student (or numeric chat ID 123456789), and click SEND TEST MESSAGE.</w:t>
+        <w:t>Click SWITCH TO LIVE BOT. The status badge will transition to green: ● LIVE BOT ACTIVE (Official Telegram Cloud API Dispatches).</w:t>
       </w:r>
     </w:p>
     <w:p>
@@ -3558,7 +3558,7 @@
           <w:color w:val="000000"/>
           <w:sz w:val="22"/>
         </w:rPr>
-        <w:t xml:space="preserve">Audit Simulation Dispatch: </w:t>
+        <w:t xml:space="preserve">Save Configuration: </w:t>
       </w:r>
       <w:r>
         <w:rPr>
@@ -3566,7 +3566,106 @@
           <w:color w:val="000000"/>
           <w:sz w:val="22"/>
         </w:rPr>
-        <w:t>Confirm the success notification appears. Click VIEW MOCK TELEGRAM LOGS to inspect the TelegramLogDialog audit table containing the recorded test entry with timestamp, recipient, and formatted markdown body.</w:t>
+        <w:t>Click SAVE CONFIGURATION to commit the credentials into the SQLite database.</w:t>
+      </w:r>
+    </w:p>
+    <w:p>
+      <w:pPr>
+        <w:spacing w:line="276" w:lineRule="auto" w:before="0" w:after="70"/>
+        <w:ind w:left="504" w:hanging="504"/>
+      </w:pPr>
+      <w:r>
+        <w:rPr>
+          <w:rFonts w:ascii="Times New Roman" w:hAnsi="Times New Roman"/>
+          <w:b/>
+          <w:color w:val="000000"/>
+          <w:sz w:val="22"/>
+        </w:rPr>
+        <w:t>7.</w:t>
+        <w:tab/>
+      </w:r>
+      <w:r>
+        <w:rPr>
+          <w:rFonts w:ascii="Times New Roman" w:hAnsi="Times New Roman"/>
+          <w:b/>
+          <w:color w:val="000000"/>
+          <w:sz w:val="22"/>
+        </w:rPr>
+        <w:t xml:space="preserve">Initialize User Channel: </w:t>
+      </w:r>
+      <w:r>
+        <w:rPr>
+          <w:rFonts w:ascii="Times New Roman" w:hAnsi="Times New Roman"/>
+          <w:color w:val="000000"/>
+          <w:sz w:val="22"/>
+        </w:rPr>
+        <w:t>On the tester's smartphone or desktop Telegram client, search for your bot handle or open https://t.me/&lt;bot_username&gt; and click START to open a conversation channel.</w:t>
+      </w:r>
+    </w:p>
+    <w:p>
+      <w:pPr>
+        <w:spacing w:line="276" w:lineRule="auto" w:before="0" w:after="70"/>
+        <w:ind w:left="504" w:hanging="504"/>
+      </w:pPr>
+      <w:r>
+        <w:rPr>
+          <w:rFonts w:ascii="Times New Roman" w:hAnsi="Times New Roman"/>
+          <w:b/>
+          <w:color w:val="000000"/>
+          <w:sz w:val="22"/>
+        </w:rPr>
+        <w:t>8.</w:t>
+        <w:tab/>
+      </w:r>
+      <w:r>
+        <w:rPr>
+          <w:rFonts w:ascii="Times New Roman" w:hAnsi="Times New Roman"/>
+          <w:b/>
+          <w:color w:val="000000"/>
+          <w:sz w:val="22"/>
+        </w:rPr>
+        <w:t xml:space="preserve">Dispatch Live Test Message: </w:t>
+      </w:r>
+      <w:r>
+        <w:rPr>
+          <w:rFonts w:ascii="Times New Roman" w:hAnsi="Times New Roman"/>
+          <w:color w:val="000000"/>
+          <w:sz w:val="22"/>
+        </w:rPr>
+        <w:t>In Super Admin, click TEST TELEGRAM DISPATCH. Enter the tester's Telegram username (@maria_student) or numeric chat ID, and click SEND TEST MESSAGE.</w:t>
+      </w:r>
+    </w:p>
+    <w:p>
+      <w:pPr>
+        <w:spacing w:line="276" w:lineRule="auto" w:before="0" w:after="70"/>
+        <w:ind w:left="504" w:hanging="504"/>
+      </w:pPr>
+      <w:r>
+        <w:rPr>
+          <w:rFonts w:ascii="Times New Roman" w:hAnsi="Times New Roman"/>
+          <w:b/>
+          <w:color w:val="000000"/>
+          <w:sz w:val="22"/>
+        </w:rPr>
+        <w:t>9.</w:t>
+        <w:tab/>
+      </w:r>
+      <w:r>
+        <w:rPr>
+          <w:rFonts w:ascii="Times New Roman" w:hAnsi="Times New Roman"/>
+          <w:b/>
+          <w:color w:val="000000"/>
+          <w:sz w:val="22"/>
+        </w:rPr>
+        <w:t xml:space="preserve">Verify Push Delivery: </w:t>
+      </w:r>
+      <w:r>
+        <w:rPr>
+          <w:rFonts w:ascii="Times New Roman" w:hAnsi="Times New Roman"/>
+          <w:color w:val="000000"/>
+          <w:sz w:val="22"/>
+        </w:rPr>
+        <w:t>Observe the tester's Telegram client: a live push notification arrives immediately with full Markdown formatting, confirming real cloud connectivity.</w:t>
       </w:r>
     </w:p>
     <w:p>
@@ -3581,7 +3680,7 @@
           <w:color w:val="000000"/>
           <w:sz w:val="23"/>
         </w:rPr>
-        <w:t>Phase 2: Generate Ticket on Student Kiosk with QR Deep-Link (Trigger 1: CREATED)</w:t>
+        <w:t>Phase 2: Generate Live Ticket on Student Kiosk with QR Deep-Link (Trigger 1: CREATED)</w:t>
       </w:r>
     </w:p>
     <w:p>
@@ -3614,7 +3713,7 @@
           <w:color w:val="000000"/>
           <w:sz w:val="22"/>
         </w:rPr>
-        <w:t>In a separate terminal, launch the Student Kiosk terminal: python run_kiosk.py.</w:t>
+        <w:t>In a separate terminal, launch the Student Registration Kiosk: python run_kiosk.py.</w:t>
       </w:r>
     </w:p>
     <w:p>
@@ -3647,7 +3746,7 @@
           <w:color w:val="000000"/>
           <w:sz w:val="22"/>
         </w:rPr>
-        <w:t>On the touchscreen check-in form, enter the following demonstration student profile:</w:t>
+        <w:t>On the check-in form, enter student credentials using an active Telegram username to receive live updates:</w:t>
         <w:br/>
         <w:t>• Student Full Name: Maria Santos</w:t>
         <w:br/>
@@ -3657,7 +3756,7 @@
         <w:br/>
         <w:t>• Mobile Number: 0918 123 4567</w:t>
         <w:br/>
-        <w:t>• Telegram Username: @maria_student</w:t>
+        <w:t>• Telegram Username: @maria_student (or tester username)</w:t>
         <w:br/>
         <w:t>• Visitor Classification: Student</w:t>
         <w:br/>
@@ -3727,15 +3826,15 @@
           <w:color w:val="000000"/>
           <w:sz w:val="22"/>
         </w:rPr>
-        <w:t>The high-resolution TicketCreatedDialog modal appears displaying:</w:t>
+        <w:t>The high-resolution TicketCreatedDialog modal appears on screen displaying:</w:t>
         <w:br/>
         <w:t>• Sequential Ticket Number #0001.</w:t>
         <w:br/>
-        <w:t>• Dynamic QR code encoding https://t.me/&lt;bot_username&gt;?start=ticket_0001.</w:t>
+        <w:t>• Live QR code encoding https://t.me/&lt;bot_username&gt;?start=ticket_0001.</w:t>
         <w:br/>
         <w:t>• Instructional banner: 'Scan QR code with smartphone camera or Telegram app to receive queue updates!'.</w:t>
         <w:br/>
-        <w:t>• Status confirmation pill: 'Telegram notification dispatched'.</w:t>
+        <w:t>• Status pill: 'Telegram notification dispatched'.</w:t>
       </w:r>
     </w:p>
     <w:p>
@@ -3760,7 +3859,7 @@
           <w:color w:val="000000"/>
           <w:sz w:val="22"/>
         </w:rPr>
-        <w:t xml:space="preserve">Verify Daemon Output: </w:t>
+        <w:t xml:space="preserve">Scan QR Code &amp; Receive Live Alert: </w:t>
       </w:r>
       <w:r>
         <w:rPr>
@@ -3768,21 +3867,56 @@
           <w:color w:val="000000"/>
           <w:sz w:val="22"/>
         </w:rPr>
-        <w:t>Switch to the Kiosk terminal console to observe the asynchronous daemon log output:</w:t>
+        <w:t>Point a real smartphone camera at the on-screen QR code:</w:t>
         <w:br/>
-        <w:t>✈️ [TELEGRAM BOT SIMULATION] To: @maria_student | Event: CREATED | Ticket: #0001</w:t>
+        <w:t>• The device opens Telegram directly to the bot with the pre-loaded ticket payload.</w:t>
         <w:br/>
-        <w:t xml:space="preserve">   "🎫 *TICKET CONFIRMED*</w:t>
+        <w:t>• Instantly, the Telegram app receives the live confirmation push alert:</w:t>
+        <w:br/>
+        <w:t xml:space="preserve">  "🎫 *TICKET CONFIRMED*</w:t>
         <w:br/>
         <w:br/>
-        <w:t xml:space="preserve">   Hello *Maria Santos*! Your ticket *#0001* has been registered.</w:t>
+        <w:t xml:space="preserve">  Hello *Maria Santos*! Your ticket *#0001* has been registered.</w:t>
         <w:br/>
-        <w:t xml:space="preserve">   • Queue Position: *1*</w:t>
+        <w:t xml:space="preserve">  • Queue Position: *1*</w:t>
         <w:br/>
-        <w:t xml:space="preserve">   • Purpose: *Registrar - Transcript*</w:t>
+        <w:t xml:space="preserve">  • Purpose: *Registrar - Transcript*</w:t>
         <w:br/>
         <w:br/>
-        <w:t xml:space="preserve">   _TapNQue Student Queue Management_"</w:t>
+        <w:t xml:space="preserve">  _TapNQue Student Queue Management_"</w:t>
+      </w:r>
+    </w:p>
+    <w:p>
+      <w:pPr>
+        <w:spacing w:line="276" w:lineRule="auto" w:before="0" w:after="70"/>
+        <w:ind w:left="504" w:hanging="504"/>
+      </w:pPr>
+      <w:r>
+        <w:rPr>
+          <w:rFonts w:ascii="Times New Roman" w:hAnsi="Times New Roman"/>
+          <w:b/>
+          <w:color w:val="000000"/>
+          <w:sz w:val="22"/>
+        </w:rPr>
+        <w:t>6.</w:t>
+        <w:tab/>
+      </w:r>
+      <w:r>
+        <w:rPr>
+          <w:rFonts w:ascii="Times New Roman" w:hAnsi="Times New Roman"/>
+          <w:b/>
+          <w:color w:val="000000"/>
+          <w:sz w:val="22"/>
+        </w:rPr>
+        <w:t xml:space="preserve">Verify Cloud Telegram Response: </w:t>
+      </w:r>
+      <w:r>
+        <w:rPr>
+          <w:rFonts w:ascii="Times New Roman" w:hAnsi="Times New Roman"/>
+          <w:color w:val="000000"/>
+          <w:sz w:val="22"/>
+        </w:rPr>
+        <w:t>Observe the Kiosk terminal console: the daemon confirms an HTTP 200 OK delivery response from https://api.telegram.org/bot&lt;token&gt;/sendMessage.</w:t>
       </w:r>
     </w:p>
     <w:p>
@@ -3888,7 +4022,7 @@
           <w:color w:val="000000"/>
           <w:sz w:val="22"/>
         </w:rPr>
-        <w:t xml:space="preserve">Trigger Called Alert: </w:t>
+        <w:t xml:space="preserve">Trigger Live Called Alert: </w:t>
       </w:r>
       <w:r>
         <w:rPr>
@@ -3898,21 +4032,19 @@
         </w:rPr>
         <w:t>Click CALL NEXT (Trigger 2):</w:t>
         <w:br/>
-        <w:t>• The Active Serving Card illuminates with Ticket #0001 assigned to Counter 1.</w:t>
+        <w:t>• Active Serving Card illuminates with Ticket #0001 assigned to Counter 1.</w:t>
         <w:br/>
-        <w:t>• The public lobby display board triggers visual flash highlights and acoustic attention cues.</w:t>
+        <w:t>• Public TV lobby monitor pulses visual call flash animations and audio chimes.</w:t>
         <w:br/>
-        <w:t>• The terminal console outputs the outbound Telegram dispatch:</w:t>
+        <w:t>• Within 500 milliseconds, the student's Telegram app vibrates with the live call alert:</w:t>
         <w:br/>
-        <w:t xml:space="preserve">  ✈️ [TELEGRAM BOT SIMULATION] To: @maria_student | Event: CALLED | Ticket: #0001</w:t>
-        <w:br/>
-        <w:t xml:space="preserve">     "🔔 *NOW SERVING ALERT*</w:t>
+        <w:t xml:space="preserve">  "🔔 *NOW SERVING ALERT*</w:t>
         <w:br/>
         <w:br/>
-        <w:t xml:space="preserve">     Ticket *#0001* (*Maria Santos*), please proceed to *Counter 1* immediately!</w:t>
+        <w:t xml:space="preserve">  Ticket *#0001* (*Maria Santos*), please proceed to *Counter 1* immediately!</w:t>
         <w:br/>
         <w:br/>
-        <w:t xml:space="preserve">     _TapNQue Student Queue Management_"</w:t>
+        <w:t xml:space="preserve">  _TapNQue Student Queue Management_"</w:t>
       </w:r>
     </w:p>
     <w:p>
@@ -3937,7 +4069,7 @@
           <w:color w:val="000000"/>
           <w:sz w:val="22"/>
         </w:rPr>
-        <w:t xml:space="preserve">Test Absentee Recall: </w:t>
+        <w:t xml:space="preserve">Test Absentee Recall Alert: </w:t>
       </w:r>
       <w:r>
         <w:rPr>
@@ -3945,7 +4077,7 @@
           <w:color w:val="000000"/>
           <w:sz w:val="22"/>
         </w:rPr>
-        <w:t>(Optional Recall Verification): Click the RECALL button. Confirm that the lobby display pulses visual animations and a renewed Telegram notification is logged to the console.</w:t>
+        <w:t>(Optional Recall Verification): Click the RECALL button. Confirm that the lobby monitor re-pulses and an updated live call alert arrives on the student's Telegram client.</w:t>
       </w:r>
     </w:p>
     <w:p>
@@ -3970,7 +4102,7 @@
           <w:color w:val="000000"/>
           <w:sz w:val="22"/>
         </w:rPr>
-        <w:t xml:space="preserve">Trigger Completed Alert: </w:t>
+        <w:t xml:space="preserve">Trigger Live Completed Alert: </w:t>
       </w:r>
       <w:r>
         <w:rPr>
@@ -3980,21 +4112,19 @@
         </w:rPr>
         <w:t>Click MARK DONE (Trigger 3):</w:t>
         <w:br/>
-        <w:t>• The transaction is finalized, wait duration is logged, and the ticket moves to history.</w:t>
+        <w:t>• Transaction is finalized, wait duration is logged, and the ticket moves to history.</w:t>
         <w:br/>
-        <w:t>• The terminal console outputs the final completion message:</w:t>
+        <w:t>• The student's Telegram client receives the final live completion notification:</w:t>
         <w:br/>
-        <w:t xml:space="preserve">  ✈️ [TELEGRAM BOT SIMULATION] To: @maria_student | Event: COMPLETED | Ticket: #0001</w:t>
-        <w:br/>
-        <w:t xml:space="preserve">     "✅ *SERVICE COMPLETED*</w:t>
+        <w:t xml:space="preserve">  "✅ *SERVICE COMPLETED*</w:t>
         <w:br/>
         <w:br/>
-        <w:t xml:space="preserve">     Ticket *#0001* has been completed at *Counter 1*.</w:t>
+        <w:t xml:space="preserve">  Ticket *#0001* has been completed at *Counter 1*.</w:t>
         <w:br/>
-        <w:t xml:space="preserve">     Thank you for visiting TapNQue!</w:t>
+        <w:t xml:space="preserve">  Thank you for visiting TapNQue!</w:t>
         <w:br/>
         <w:br/>
-        <w:t xml:space="preserve">     _TapNQue Student Queue Management_"</w:t>
+        <w:t xml:space="preserve">  _TapNQue Student Queue Management_"</w:t>
       </w:r>
     </w:p>
     <w:p>
@@ -4009,7 +4139,7 @@
           <w:color w:val="000000"/>
           <w:sz w:val="23"/>
         </w:rPr>
-        <w:t>Phase 4: Verify Audit Trail &amp; Database Records in SQLite</w:t>
+        <w:t>Phase 4: Verify Live Delivery Records &amp; SQLite Persistence</w:t>
       </w:r>
     </w:p>
     <w:p>
@@ -4034,7 +4164,7 @@
           <w:color w:val="000000"/>
           <w:sz w:val="22"/>
         </w:rPr>
-        <w:t xml:space="preserve">Open Audit Modal: </w:t>
+        <w:t xml:space="preserve">Verify Database Records: </w:t>
       </w:r>
       <w:r>
         <w:rPr>
@@ -4042,7 +4172,9 @@
           <w:color w:val="000000"/>
           <w:sz w:val="22"/>
         </w:rPr>
-        <w:t>Return to Super Admin &gt; Settings &gt; click VIEW MOCK TELEGRAM LOGS.</w:t>
+        <w:t>Query the local SQLite database from a terminal to verify that all three triggers recorded live 'sent' status:</w:t>
+        <w:br/>
+        <w:t>python -c "import sqlite3; conn = sqlite3.connect('data/kiosk.db'); print(conn.execute('SELECT ticket_number, telegram_chat_id, telegram_status_created, telegram_status_called, telegram_status_completed FROM tickets WHERE ticket_number=1').fetchone())"</w:t>
       </w:r>
     </w:p>
     <w:p>
@@ -4067,74 +4199,6 @@
           <w:color w:val="000000"/>
           <w:sz w:val="22"/>
         </w:rPr>
-        <w:t xml:space="preserve">Verify GUI Audit Log: </w:t>
-      </w:r>
-      <w:r>
-        <w:rPr>
-          <w:rFonts w:ascii="Times New Roman" w:hAnsi="Times New Roman"/>
-          <w:color w:val="000000"/>
-          <w:sz w:val="22"/>
-        </w:rPr>
-        <w:t>Review the interactive audit table. Confirm all three transaction dispatches (CREATED, CALLED, COMPLETED) are chronologically documented with exact timestamps, recipient handles (@maria_student), and full Markdown formatting.</w:t>
-      </w:r>
-    </w:p>
-    <w:p>
-      <w:pPr>
-        <w:spacing w:line="276" w:lineRule="auto" w:before="0" w:after="70"/>
-        <w:ind w:left="504" w:hanging="504"/>
-      </w:pPr>
-      <w:r>
-        <w:rPr>
-          <w:rFonts w:ascii="Times New Roman" w:hAnsi="Times New Roman"/>
-          <w:b/>
-          <w:color w:val="000000"/>
-          <w:sz w:val="22"/>
-        </w:rPr>
-        <w:t>3.</w:t>
-        <w:tab/>
-      </w:r>
-      <w:r>
-        <w:rPr>
-          <w:rFonts w:ascii="Times New Roman" w:hAnsi="Times New Roman"/>
-          <w:b/>
-          <w:color w:val="000000"/>
-          <w:sz w:val="22"/>
-        </w:rPr>
-        <w:t xml:space="preserve">Verify Database Records: </w:t>
-      </w:r>
-      <w:r>
-        <w:rPr>
-          <w:rFonts w:ascii="Times New Roman" w:hAnsi="Times New Roman"/>
-          <w:color w:val="000000"/>
-          <w:sz w:val="22"/>
-        </w:rPr>
-        <w:t>Query the local SQLite database from a terminal to verify thread-safe persistence:</w:t>
-        <w:br/>
-        <w:t>python -c "import sqlite3; conn = sqlite3.connect('data/kiosk.db'); print(conn.execute('SELECT ticket_number, telegram_chat_id, telegram_status_created, telegram_status_called, telegram_status_completed FROM tickets WHERE ticket_number=1').fetchone())"</w:t>
-      </w:r>
-    </w:p>
-    <w:p>
-      <w:pPr>
-        <w:spacing w:line="276" w:lineRule="auto" w:before="0" w:after="70"/>
-        <w:ind w:left="504" w:hanging="504"/>
-      </w:pPr>
-      <w:r>
-        <w:rPr>
-          <w:rFonts w:ascii="Times New Roman" w:hAnsi="Times New Roman"/>
-          <w:b/>
-          <w:color w:val="000000"/>
-          <w:sz w:val="22"/>
-        </w:rPr>
-        <w:t>4.</w:t>
-        <w:tab/>
-      </w:r>
-      <w:r>
-        <w:rPr>
-          <w:rFonts w:ascii="Times New Roman" w:hAnsi="Times New Roman"/>
-          <w:b/>
-          <w:color w:val="000000"/>
-          <w:sz w:val="22"/>
-        </w:rPr>
         <w:t xml:space="preserve">Inspect Database Result: </w:t>
       </w:r>
       <w:r>
@@ -4145,7 +4209,9 @@
         </w:rPr>
         <w:t>Confirm terminal query output returns:</w:t>
         <w:br/>
-        <w:t>(1, '@maria_student', 'mock_sent', 'mock_sent', 'mock_sent')</w:t>
+        <w:t>(1, '@maria_student', 'sent', 'sent', 'sent')</w:t>
+        <w:br/>
+        <w:t>(Note: in live bot mode, status values transition to 'sent' upon Telegram Bot API HTTP 200 confirmation, verifying real cloud execution).</w:t>
       </w:r>
     </w:p>
     <w:p>
@@ -7100,7 +7166,7 @@
         <w:color w:val="000000"/>
         <w:sz w:val="18"/>
       </w:rPr>
-      <w:t>TapNQue • Telegram QR Bot API System Guide &amp; Walkthrough Manual (Doc ID: TNQ-DOC-MAN-2026-03-TELEGRAM)</w:t>
+      <w:t>TapNQue • Telegram QR Bot API System Guide &amp; Live Testing Manual (Doc ID: TNQ-DOC-MAN-2026-03-TELEGRAM)</w:t>
     </w:r>
   </w:p>
 </w:ftr>

</xml_diff>